<commit_message>
Wrote to my documentation
</commit_message>
<xml_diff>
--- a/docs/EchoPlay_Projektdokumentation_250514.docx
+++ b/docs/EchoPlay_Projektdokumentation_250514.docx
@@ -1380,7 +1380,7 @@
       <w:r>
         <w:fldChar w:fldCharType="separate"/>
       </w:r>
-      <w:hyperlink w:anchor="_Toc207105979" w:history="1">
+      <w:hyperlink w:anchor="_Toc222230582" w:history="1">
         <w:r>
           <w:rPr>
             <w:rStyle w:val="Hyperlink"/>
@@ -1421,7 +1421,7 @@
           <w:rPr>
             <w:webHidden/>
           </w:rPr>
-          <w:instrText xml:space="preserve"> PAGEREF _Toc207105979 \h </w:instrText>
+          <w:instrText xml:space="preserve"> PAGEREF _Toc222230582 \h </w:instrText>
         </w:r>
         <w:r>
           <w:rPr>
@@ -1462,7 +1462,7 @@
           <w14:ligatures w14:val="standardContextual"/>
         </w:rPr>
       </w:pPr>
-      <w:hyperlink w:anchor="_Toc207105980" w:history="1">
+      <w:hyperlink w:anchor="_Toc222230583" w:history="1">
         <w:r>
           <w:rPr>
             <w:rStyle w:val="Hyperlink"/>
@@ -1504,7 +1504,7 @@
           <w:rPr>
             <w:webHidden/>
           </w:rPr>
-          <w:instrText xml:space="preserve"> PAGEREF _Toc207105980 \h </w:instrText>
+          <w:instrText xml:space="preserve"> PAGEREF _Toc222230583 \h </w:instrText>
         </w:r>
         <w:r>
           <w:rPr>
@@ -1545,7 +1545,7 @@
           <w14:ligatures w14:val="standardContextual"/>
         </w:rPr>
       </w:pPr>
-      <w:hyperlink w:anchor="_Toc207105981" w:history="1">
+      <w:hyperlink w:anchor="_Toc222230584" w:history="1">
         <w:r>
           <w:rPr>
             <w:rStyle w:val="Hyperlink"/>
@@ -1587,7 +1587,7 @@
           <w:rPr>
             <w:webHidden/>
           </w:rPr>
-          <w:instrText xml:space="preserve"> PAGEREF _Toc207105981 \h </w:instrText>
+          <w:instrText xml:space="preserve"> PAGEREF _Toc222230584 \h </w:instrText>
         </w:r>
         <w:r>
           <w:rPr>
@@ -1626,7 +1626,7 @@
           <w14:ligatures w14:val="standardContextual"/>
         </w:rPr>
       </w:pPr>
-      <w:hyperlink w:anchor="_Toc207105982" w:history="1">
+      <w:hyperlink w:anchor="_Toc222230585" w:history="1">
         <w:r>
           <w:rPr>
             <w:rStyle w:val="Hyperlink"/>
@@ -1666,7 +1666,7 @@
           <w:rPr>
             <w:webHidden/>
           </w:rPr>
-          <w:instrText xml:space="preserve"> PAGEREF _Toc207105982 \h </w:instrText>
+          <w:instrText xml:space="preserve"> PAGEREF _Toc222230585 \h </w:instrText>
         </w:r>
         <w:r>
           <w:rPr>
@@ -1705,7 +1705,7 @@
           <w14:ligatures w14:val="standardContextual"/>
         </w:rPr>
       </w:pPr>
-      <w:hyperlink w:anchor="_Toc207105983" w:history="1">
+      <w:hyperlink w:anchor="_Toc222230586" w:history="1">
         <w:r>
           <w:rPr>
             <w:rStyle w:val="Hyperlink"/>
@@ -1745,7 +1745,7 @@
           <w:rPr>
             <w:webHidden/>
           </w:rPr>
-          <w:instrText xml:space="preserve"> PAGEREF _Toc207105983 \h </w:instrText>
+          <w:instrText xml:space="preserve"> PAGEREF _Toc222230586 \h </w:instrText>
         </w:r>
         <w:r>
           <w:rPr>
@@ -1786,7 +1786,7 @@
           <w14:ligatures w14:val="standardContextual"/>
         </w:rPr>
       </w:pPr>
-      <w:hyperlink w:anchor="_Toc207105984" w:history="1">
+      <w:hyperlink w:anchor="_Toc222230587" w:history="1">
         <w:r>
           <w:rPr>
             <w:rStyle w:val="Hyperlink"/>
@@ -1828,7 +1828,7 @@
           <w:rPr>
             <w:webHidden/>
           </w:rPr>
-          <w:instrText xml:space="preserve"> PAGEREF _Toc207105984 \h </w:instrText>
+          <w:instrText xml:space="preserve"> PAGEREF _Toc222230587 \h </w:instrText>
         </w:r>
         <w:r>
           <w:rPr>
@@ -1867,7 +1867,7 @@
           <w14:ligatures w14:val="standardContextual"/>
         </w:rPr>
       </w:pPr>
-      <w:hyperlink w:anchor="_Toc207105985" w:history="1">
+      <w:hyperlink w:anchor="_Toc222230588" w:history="1">
         <w:r>
           <w:rPr>
             <w:rStyle w:val="Hyperlink"/>
@@ -1907,7 +1907,7 @@
           <w:rPr>
             <w:webHidden/>
           </w:rPr>
-          <w:instrText xml:space="preserve"> PAGEREF _Toc207105985 \h </w:instrText>
+          <w:instrText xml:space="preserve"> PAGEREF _Toc222230588 \h </w:instrText>
         </w:r>
         <w:r>
           <w:rPr>
@@ -1946,7 +1946,7 @@
           <w14:ligatures w14:val="standardContextual"/>
         </w:rPr>
       </w:pPr>
-      <w:hyperlink w:anchor="_Toc207105986" w:history="1">
+      <w:hyperlink w:anchor="_Toc222230589" w:history="1">
         <w:r>
           <w:rPr>
             <w:rStyle w:val="Hyperlink"/>
@@ -1986,7 +1986,86 @@
           <w:rPr>
             <w:webHidden/>
           </w:rPr>
-          <w:instrText xml:space="preserve"> PAGEREF _Toc207105986 \h </w:instrText>
+          <w:instrText xml:space="preserve"> PAGEREF _Toc222230589 \h </w:instrText>
+        </w:r>
+        <w:r>
+          <w:rPr>
+            <w:webHidden/>
+          </w:rPr>
+        </w:r>
+        <w:r>
+          <w:rPr>
+            <w:webHidden/>
+          </w:rPr>
+          <w:fldChar w:fldCharType="separate"/>
+        </w:r>
+        <w:r>
+          <w:rPr>
+            <w:webHidden/>
+          </w:rPr>
+          <w:t>9</w:t>
+        </w:r>
+        <w:r>
+          <w:rPr>
+            <w:webHidden/>
+          </w:rPr>
+          <w:fldChar w:fldCharType="end"/>
+        </w:r>
+      </w:hyperlink>
+    </w:p>
+    <w:p>
+      <w:pPr>
+        <w:pStyle w:val="Verzeichnis3"/>
+        <w:rPr>
+          <w:rFonts w:asciiTheme="minorHAnsi" w:eastAsiaTheme="minorEastAsia" w:hAnsiTheme="minorHAnsi" w:cstheme="minorBidi"/>
+          <w:kern w:val="2"/>
+          <w:sz w:val="24"/>
+          <w:szCs w:val="24"/>
+          <w:lang w:eastAsia="de-CH"/>
+          <w14:ligatures w14:val="standardContextual"/>
+        </w:rPr>
+      </w:pPr>
+      <w:hyperlink w:anchor="_Toc222230590" w:history="1">
+        <w:r>
+          <w:rPr>
+            <w:rStyle w:val="Hyperlink"/>
+          </w:rPr>
+          <w:t>1.3.3</w:t>
+        </w:r>
+        <w:r>
+          <w:rPr>
+            <w:rFonts w:asciiTheme="minorHAnsi" w:eastAsiaTheme="minorEastAsia" w:hAnsiTheme="minorHAnsi" w:cstheme="minorBidi"/>
+            <w:kern w:val="2"/>
+            <w:sz w:val="24"/>
+            <w:szCs w:val="24"/>
+            <w:lang w:eastAsia="de-CH"/>
+            <w14:ligatures w14:val="standardContextual"/>
+          </w:rPr>
+          <w:tab/>
+        </w:r>
+        <w:r>
+          <w:rPr>
+            <w:rStyle w:val="Hyperlink"/>
+          </w:rPr>
+          <w:t>Programm Code Planung</w:t>
+        </w:r>
+        <w:r>
+          <w:rPr>
+            <w:webHidden/>
+          </w:rPr>
+          <w:tab/>
+        </w:r>
+        <w:r>
+          <w:rPr>
+            <w:webHidden/>
+          </w:rPr>
+          <w:fldChar w:fldCharType="begin"/>
+        </w:r>
+        <w:r>
+          <w:rPr>
+            <w:webHidden/>
+          </w:rPr>
+          <w:instrText xml:space="preserve"> PAGEREF _Toc222230590 \h </w:instrText>
         </w:r>
         <w:r>
           <w:rPr>
@@ -2027,7 +2106,7 @@
           <w14:ligatures w14:val="standardContextual"/>
         </w:rPr>
       </w:pPr>
-      <w:hyperlink w:anchor="_Toc207105987" w:history="1">
+      <w:hyperlink w:anchor="_Toc222230591" w:history="1">
         <w:r>
           <w:rPr>
             <w:rStyle w:val="Hyperlink"/>
@@ -2069,7 +2148,86 @@
           <w:rPr>
             <w:webHidden/>
           </w:rPr>
-          <w:instrText xml:space="preserve"> PAGEREF _Toc207105987 \h </w:instrText>
+          <w:instrText xml:space="preserve"> PAGEREF _Toc222230591 \h </w:instrText>
+        </w:r>
+        <w:r>
+          <w:rPr>
+            <w:webHidden/>
+          </w:rPr>
+        </w:r>
+        <w:r>
+          <w:rPr>
+            <w:webHidden/>
+          </w:rPr>
+          <w:fldChar w:fldCharType="separate"/>
+        </w:r>
+        <w:r>
+          <w:rPr>
+            <w:webHidden/>
+          </w:rPr>
+          <w:t>9</w:t>
+        </w:r>
+        <w:r>
+          <w:rPr>
+            <w:webHidden/>
+          </w:rPr>
+          <w:fldChar w:fldCharType="end"/>
+        </w:r>
+      </w:hyperlink>
+    </w:p>
+    <w:p>
+      <w:pPr>
+        <w:pStyle w:val="Verzeichnis3"/>
+        <w:rPr>
+          <w:rFonts w:asciiTheme="minorHAnsi" w:eastAsiaTheme="minorEastAsia" w:hAnsiTheme="minorHAnsi" w:cstheme="minorBidi"/>
+          <w:kern w:val="2"/>
+          <w:sz w:val="24"/>
+          <w:szCs w:val="24"/>
+          <w:lang w:eastAsia="de-CH"/>
+          <w14:ligatures w14:val="standardContextual"/>
+        </w:rPr>
+      </w:pPr>
+      <w:hyperlink w:anchor="_Toc222230592" w:history="1">
+        <w:r>
+          <w:rPr>
+            <w:rStyle w:val="Hyperlink"/>
+          </w:rPr>
+          <w:t>1.4.1</w:t>
+        </w:r>
+        <w:r>
+          <w:rPr>
+            <w:rFonts w:asciiTheme="minorHAnsi" w:eastAsiaTheme="minorEastAsia" w:hAnsiTheme="minorHAnsi" w:cstheme="minorBidi"/>
+            <w:kern w:val="2"/>
+            <w:sz w:val="24"/>
+            <w:szCs w:val="24"/>
+            <w:lang w:eastAsia="de-CH"/>
+            <w14:ligatures w14:val="standardContextual"/>
+          </w:rPr>
+          <w:tab/>
+        </w:r>
+        <w:r>
+          <w:rPr>
+            <w:rStyle w:val="Hyperlink"/>
+          </w:rPr>
+          <w:t>Stückliste</w:t>
+        </w:r>
+        <w:r>
+          <w:rPr>
+            <w:webHidden/>
+          </w:rPr>
+          <w:tab/>
+        </w:r>
+        <w:r>
+          <w:rPr>
+            <w:webHidden/>
+          </w:rPr>
+          <w:fldChar w:fldCharType="begin"/>
+        </w:r>
+        <w:r>
+          <w:rPr>
+            <w:webHidden/>
+          </w:rPr>
+          <w:instrText xml:space="preserve"> PAGEREF _Toc222230592 \h </w:instrText>
         </w:r>
         <w:r>
           <w:rPr>
@@ -2110,7 +2268,7 @@
           <w14:ligatures w14:val="standardContextual"/>
         </w:rPr>
       </w:pPr>
-      <w:hyperlink w:anchor="_Toc207105988" w:history="1">
+      <w:hyperlink w:anchor="_Toc222230593" w:history="1">
         <w:r>
           <w:rPr>
             <w:rStyle w:val="Hyperlink"/>
@@ -2152,7 +2310,7 @@
           <w:rPr>
             <w:webHidden/>
           </w:rPr>
-          <w:instrText xml:space="preserve"> PAGEREF _Toc207105988 \h </w:instrText>
+          <w:instrText xml:space="preserve"> PAGEREF _Toc222230593 \h </w:instrText>
         </w:r>
         <w:r>
           <w:rPr>
@@ -2191,7 +2349,7 @@
           <w14:ligatures w14:val="standardContextual"/>
         </w:rPr>
       </w:pPr>
-      <w:hyperlink w:anchor="_Toc207105989" w:history="1">
+      <w:hyperlink w:anchor="_Toc222230594" w:history="1">
         <w:r>
           <w:rPr>
             <w:rStyle w:val="Hyperlink"/>
@@ -2231,7 +2389,7 @@
           <w:rPr>
             <w:webHidden/>
           </w:rPr>
-          <w:instrText xml:space="preserve"> PAGEREF _Toc207105989 \h </w:instrText>
+          <w:instrText xml:space="preserve"> PAGEREF _Toc222230594 \h </w:instrText>
         </w:r>
         <w:r>
           <w:rPr>
@@ -2270,7 +2428,7 @@
           <w14:ligatures w14:val="standardContextual"/>
         </w:rPr>
       </w:pPr>
-      <w:hyperlink w:anchor="_Toc207105990" w:history="1">
+      <w:hyperlink w:anchor="_Toc222230595" w:history="1">
         <w:r>
           <w:rPr>
             <w:rStyle w:val="Hyperlink"/>
@@ -2310,7 +2468,7 @@
           <w:rPr>
             <w:webHidden/>
           </w:rPr>
-          <w:instrText xml:space="preserve"> PAGEREF _Toc207105990 \h </w:instrText>
+          <w:instrText xml:space="preserve"> PAGEREF _Toc222230595 \h </w:instrText>
         </w:r>
         <w:r>
           <w:rPr>
@@ -2349,7 +2507,7 @@
           <w14:ligatures w14:val="standardContextual"/>
         </w:rPr>
       </w:pPr>
-      <w:hyperlink w:anchor="_Toc207105991" w:history="1">
+      <w:hyperlink w:anchor="_Toc222230596" w:history="1">
         <w:r>
           <w:rPr>
             <w:rStyle w:val="Hyperlink"/>
@@ -2389,7 +2547,7 @@
           <w:rPr>
             <w:webHidden/>
           </w:rPr>
-          <w:instrText xml:space="preserve"> PAGEREF _Toc207105991 \h </w:instrText>
+          <w:instrText xml:space="preserve"> PAGEREF _Toc222230596 \h </w:instrText>
         </w:r>
         <w:r>
           <w:rPr>
@@ -2406,7 +2564,7 @@
           <w:rPr>
             <w:webHidden/>
           </w:rPr>
-          <w:t>12</w:t>
+          <w:t>13</w:t>
         </w:r>
         <w:r>
           <w:rPr>
@@ -2428,7 +2586,7 @@
           <w14:ligatures w14:val="standardContextual"/>
         </w:rPr>
       </w:pPr>
-      <w:hyperlink w:anchor="_Toc207105992" w:history="1">
+      <w:hyperlink w:anchor="_Toc222230597" w:history="1">
         <w:r>
           <w:rPr>
             <w:rStyle w:val="Hyperlink"/>
@@ -2468,7 +2626,7 @@
           <w:rPr>
             <w:webHidden/>
           </w:rPr>
-          <w:instrText xml:space="preserve"> PAGEREF _Toc207105992 \h </w:instrText>
+          <w:instrText xml:space="preserve"> PAGEREF _Toc222230597 \h </w:instrText>
         </w:r>
         <w:r>
           <w:rPr>
@@ -2485,7 +2643,86 @@
           <w:rPr>
             <w:webHidden/>
           </w:rPr>
-          <w:t>13</w:t>
+          <w:t>14</w:t>
+        </w:r>
+        <w:r>
+          <w:rPr>
+            <w:webHidden/>
+          </w:rPr>
+          <w:fldChar w:fldCharType="end"/>
+        </w:r>
+      </w:hyperlink>
+    </w:p>
+    <w:p>
+      <w:pPr>
+        <w:pStyle w:val="Verzeichnis3"/>
+        <w:rPr>
+          <w:rFonts w:asciiTheme="minorHAnsi" w:eastAsiaTheme="minorEastAsia" w:hAnsiTheme="minorHAnsi" w:cstheme="minorBidi"/>
+          <w:kern w:val="2"/>
+          <w:sz w:val="24"/>
+          <w:szCs w:val="24"/>
+          <w:lang w:eastAsia="de-CH"/>
+          <w14:ligatures w14:val="standardContextual"/>
+        </w:rPr>
+      </w:pPr>
+      <w:hyperlink w:anchor="_Toc222230598" w:history="1">
+        <w:r>
+          <w:rPr>
+            <w:rStyle w:val="Hyperlink"/>
+          </w:rPr>
+          <w:t>1.5.5</w:t>
+        </w:r>
+        <w:r>
+          <w:rPr>
+            <w:rFonts w:asciiTheme="minorHAnsi" w:eastAsiaTheme="minorEastAsia" w:hAnsiTheme="minorHAnsi" w:cstheme="minorBidi"/>
+            <w:kern w:val="2"/>
+            <w:sz w:val="24"/>
+            <w:szCs w:val="24"/>
+            <w:lang w:eastAsia="de-CH"/>
+            <w14:ligatures w14:val="standardContextual"/>
+          </w:rPr>
+          <w:tab/>
+        </w:r>
+        <w:r>
+          <w:rPr>
+            <w:rStyle w:val="Hyperlink"/>
+          </w:rPr>
+          <w:t>Code Dokumentation</w:t>
+        </w:r>
+        <w:r>
+          <w:rPr>
+            <w:webHidden/>
+          </w:rPr>
+          <w:tab/>
+        </w:r>
+        <w:r>
+          <w:rPr>
+            <w:webHidden/>
+          </w:rPr>
+          <w:fldChar w:fldCharType="begin"/>
+        </w:r>
+        <w:r>
+          <w:rPr>
+            <w:webHidden/>
+          </w:rPr>
+          <w:instrText xml:space="preserve"> PAGEREF _Toc222230598 \h </w:instrText>
+        </w:r>
+        <w:r>
+          <w:rPr>
+            <w:webHidden/>
+          </w:rPr>
+        </w:r>
+        <w:r>
+          <w:rPr>
+            <w:webHidden/>
+          </w:rPr>
+          <w:fldChar w:fldCharType="separate"/>
+        </w:r>
+        <w:r>
+          <w:rPr>
+            <w:webHidden/>
+          </w:rPr>
+          <w:t>14</w:t>
         </w:r>
         <w:r>
           <w:rPr>
@@ -2509,7 +2746,7 @@
           <w14:ligatures w14:val="standardContextual"/>
         </w:rPr>
       </w:pPr>
-      <w:hyperlink w:anchor="_Toc207105993" w:history="1">
+      <w:hyperlink w:anchor="_Toc222230599" w:history="1">
         <w:r>
           <w:rPr>
             <w:rStyle w:val="Hyperlink"/>
@@ -2551,7 +2788,7 @@
           <w:rPr>
             <w:webHidden/>
           </w:rPr>
-          <w:instrText xml:space="preserve"> PAGEREF _Toc207105993 \h </w:instrText>
+          <w:instrText xml:space="preserve"> PAGEREF _Toc222230599 \h </w:instrText>
         </w:r>
         <w:r>
           <w:rPr>
@@ -2568,7 +2805,7 @@
           <w:rPr>
             <w:webHidden/>
           </w:rPr>
-          <w:t>13</w:t>
+          <w:t>15</w:t>
         </w:r>
         <w:r>
           <w:rPr>
@@ -2592,7 +2829,7 @@
           <w14:ligatures w14:val="standardContextual"/>
         </w:rPr>
       </w:pPr>
-      <w:hyperlink w:anchor="_Toc207105994" w:history="1">
+      <w:hyperlink w:anchor="_Toc222230600" w:history="1">
         <w:r>
           <w:rPr>
             <w:rStyle w:val="Hyperlink"/>
@@ -2634,7 +2871,7 @@
           <w:rPr>
             <w:webHidden/>
           </w:rPr>
-          <w:instrText xml:space="preserve"> PAGEREF _Toc207105994 \h </w:instrText>
+          <w:instrText xml:space="preserve"> PAGEREF _Toc222230600 \h </w:instrText>
         </w:r>
         <w:r>
           <w:rPr>
@@ -2651,7 +2888,7 @@
           <w:rPr>
             <w:webHidden/>
           </w:rPr>
-          <w:t>13</w:t>
+          <w:t>15</w:t>
         </w:r>
         <w:r>
           <w:rPr>
@@ -2674,7 +2911,7 @@
           <w14:ligatures w14:val="standardContextual"/>
         </w:rPr>
       </w:pPr>
-      <w:hyperlink w:anchor="_Toc207105995" w:history="1">
+      <w:hyperlink w:anchor="_Toc222230601" w:history="1">
         <w:r>
           <w:rPr>
             <w:rStyle w:val="Hyperlink"/>
@@ -2715,7 +2952,7 @@
           <w:rPr>
             <w:webHidden/>
           </w:rPr>
-          <w:instrText xml:space="preserve"> PAGEREF _Toc207105995 \h </w:instrText>
+          <w:instrText xml:space="preserve"> PAGEREF _Toc222230601 \h </w:instrText>
         </w:r>
         <w:r>
           <w:rPr>
@@ -2732,7 +2969,7 @@
           <w:rPr>
             <w:webHidden/>
           </w:rPr>
-          <w:t>14</w:t>
+          <w:t>16</w:t>
         </w:r>
         <w:r>
           <w:rPr>
@@ -2756,7 +2993,7 @@
           <w14:ligatures w14:val="standardContextual"/>
         </w:rPr>
       </w:pPr>
-      <w:hyperlink w:anchor="_Toc207105996" w:history="1">
+      <w:hyperlink w:anchor="_Toc222230602" w:history="1">
         <w:r>
           <w:rPr>
             <w:rStyle w:val="Hyperlink"/>
@@ -2798,7 +3035,7 @@
           <w:rPr>
             <w:webHidden/>
           </w:rPr>
-          <w:instrText xml:space="preserve"> PAGEREF _Toc207105996 \h </w:instrText>
+          <w:instrText xml:space="preserve"> PAGEREF _Toc222230602 \h </w:instrText>
         </w:r>
         <w:r>
           <w:rPr>
@@ -2815,7 +3052,7 @@
           <w:rPr>
             <w:webHidden/>
           </w:rPr>
-          <w:t>14</w:t>
+          <w:t>16</w:t>
         </w:r>
         <w:r>
           <w:rPr>
@@ -2839,7 +3076,7 @@
           <w14:ligatures w14:val="standardContextual"/>
         </w:rPr>
       </w:pPr>
-      <w:hyperlink w:anchor="_Toc207105997" w:history="1">
+      <w:hyperlink w:anchor="_Toc222230603" w:history="1">
         <w:r>
           <w:rPr>
             <w:rStyle w:val="Hyperlink"/>
@@ -2881,7 +3118,7 @@
           <w:rPr>
             <w:webHidden/>
           </w:rPr>
-          <w:instrText xml:space="preserve"> PAGEREF _Toc207105997 \h </w:instrText>
+          <w:instrText xml:space="preserve"> PAGEREF _Toc222230603 \h </w:instrText>
         </w:r>
         <w:r>
           <w:rPr>
@@ -2898,7 +3135,7 @@
           <w:rPr>
             <w:webHidden/>
           </w:rPr>
-          <w:t>14</w:t>
+          <w:t>16</w:t>
         </w:r>
         <w:r>
           <w:rPr>
@@ -2922,7 +3159,7 @@
           <w14:ligatures w14:val="standardContextual"/>
         </w:rPr>
       </w:pPr>
-      <w:hyperlink w:anchor="_Toc207105998" w:history="1">
+      <w:hyperlink w:anchor="_Toc222230604" w:history="1">
         <w:r>
           <w:rPr>
             <w:rStyle w:val="Hyperlink"/>
@@ -2964,7 +3201,7 @@
           <w:rPr>
             <w:webHidden/>
           </w:rPr>
-          <w:instrText xml:space="preserve"> PAGEREF _Toc207105998 \h </w:instrText>
+          <w:instrText xml:space="preserve"> PAGEREF _Toc222230604 \h </w:instrText>
         </w:r>
         <w:r>
           <w:rPr>
@@ -2981,7 +3218,7 @@
           <w:rPr>
             <w:webHidden/>
           </w:rPr>
-          <w:t>14</w:t>
+          <w:t>16</w:t>
         </w:r>
         <w:r>
           <w:rPr>
@@ -3000,7 +3237,7 @@
         <w:fldChar w:fldCharType="end"/>
       </w:r>
     </w:p>
-    <w:bookmarkStart w:id="1" w:name="_Toc207105979"/>
+    <w:bookmarkStart w:id="1" w:name="_Toc222230582"/>
     <w:p>
       <w:pPr>
         <w:pStyle w:val="berschrift1"/>
@@ -3230,7 +3467,7 @@
       <w:pPr>
         <w:pStyle w:val="berschrift2"/>
       </w:pPr>
-      <w:bookmarkStart w:id="2" w:name="_Toc207105980"/>
+      <w:bookmarkStart w:id="2" w:name="_Toc222230583"/>
       <w:r>
         <w:t>Ausgangslage</w:t>
       </w:r>
@@ -3257,7 +3494,7 @@
       <w:pPr>
         <w:pStyle w:val="berschrift2"/>
       </w:pPr>
-      <w:bookmarkStart w:id="3" w:name="_Toc207105981"/>
+      <w:bookmarkStart w:id="3" w:name="_Toc222230584"/>
       <w:r>
         <w:t>Informieren</w:t>
       </w:r>
@@ -3267,7 +3504,7 @@
       <w:pPr>
         <w:pStyle w:val="berschrift3"/>
       </w:pPr>
-      <w:bookmarkStart w:id="4" w:name="_Toc207105982"/>
+      <w:bookmarkStart w:id="4" w:name="_Toc222230585"/>
       <w:r>
         <w:t>Komponente</w:t>
       </w:r>
@@ -3363,7 +3600,8 @@
       <w:pPr>
         <w:pStyle w:val="Beschriftung"/>
       </w:pPr>
-      <w:bookmarkStart w:id="5" w:name="_Toc198107273"/>
+      <w:bookmarkStart w:id="5" w:name="_Toc222227731"/>
+      <w:bookmarkStart w:id="6" w:name="_Toc222236756"/>
       <w:r>
         <w:t xml:space="preserve">Abbildung </w:t>
       </w:r>
@@ -3382,6 +3620,7 @@
         <w:t xml:space="preserve"> LED-Box</w:t>
       </w:r>
       <w:bookmarkEnd w:id="5"/>
+      <w:bookmarkEnd w:id="6"/>
     </w:p>
     <w:p>
       <w:r>
@@ -3595,7 +3834,8 @@
       <w:pPr>
         <w:pStyle w:val="Beschriftung"/>
       </w:pPr>
-      <w:bookmarkStart w:id="6" w:name="_Toc198107274"/>
+      <w:bookmarkStart w:id="7" w:name="_Toc222227732"/>
+      <w:bookmarkStart w:id="8" w:name="_Toc222236757"/>
       <w:r>
         <w:t xml:space="preserve">Abbildung </w:t>
       </w:r>
@@ -3610,7 +3850,8 @@
       <w:r>
         <w:t xml:space="preserve"> LED-Screen</w:t>
       </w:r>
-      <w:bookmarkEnd w:id="6"/>
+      <w:bookmarkEnd w:id="7"/>
+      <w:bookmarkEnd w:id="8"/>
     </w:p>
     <w:p>
       <w:pPr>
@@ -3748,7 +3989,8 @@
       <w:pPr>
         <w:pStyle w:val="Beschriftung"/>
       </w:pPr>
-      <w:bookmarkStart w:id="7" w:name="_Toc198107275"/>
+      <w:bookmarkStart w:id="9" w:name="_Toc222227733"/>
+      <w:bookmarkStart w:id="10" w:name="_Toc222236758"/>
       <w:r>
         <w:t xml:space="preserve">Abbildung </w:t>
       </w:r>
@@ -3766,7 +4008,8 @@
         </w:rPr>
         <w:t xml:space="preserve"> Original Carrier Board</w:t>
       </w:r>
-      <w:bookmarkEnd w:id="7"/>
+      <w:bookmarkEnd w:id="9"/>
+      <w:bookmarkEnd w:id="10"/>
     </w:p>
     <w:p>
       <w:r>
@@ -3873,7 +4116,8 @@
           <w:bCs/>
         </w:rPr>
       </w:pPr>
-      <w:bookmarkStart w:id="8" w:name="_Toc198107276"/>
+      <w:bookmarkStart w:id="11" w:name="_Toc222227734"/>
+      <w:bookmarkStart w:id="12" w:name="_Toc222236759"/>
       <w:r>
         <w:t xml:space="preserve">Abbildung </w:t>
       </w:r>
@@ -3891,7 +4135,8 @@
         </w:rPr>
         <w:t xml:space="preserve"> PIC16F684</w:t>
       </w:r>
-      <w:bookmarkEnd w:id="8"/>
+      <w:bookmarkEnd w:id="11"/>
+      <w:bookmarkEnd w:id="12"/>
     </w:p>
     <w:p>
       <w:r>
@@ -4006,7 +4251,8 @@
           <w:bCs/>
         </w:rPr>
       </w:pPr>
-      <w:bookmarkStart w:id="9" w:name="_Toc198107277"/>
+      <w:bookmarkStart w:id="13" w:name="_Toc222227735"/>
+      <w:bookmarkStart w:id="14" w:name="_Toc222236760"/>
       <w:r>
         <w:t xml:space="preserve">Abbildung </w:t>
       </w:r>
@@ -4024,7 +4270,8 @@
         </w:rPr>
         <w:t xml:space="preserve"> LM358</w:t>
       </w:r>
-      <w:bookmarkEnd w:id="9"/>
+      <w:bookmarkEnd w:id="13"/>
+      <w:bookmarkEnd w:id="14"/>
     </w:p>
     <w:p>
       <w:r>
@@ -4127,7 +4374,8 @@
           <w:bCs/>
         </w:rPr>
       </w:pPr>
-      <w:bookmarkStart w:id="10" w:name="_Toc198107278"/>
+      <w:bookmarkStart w:id="15" w:name="_Toc222227736"/>
+      <w:bookmarkStart w:id="16" w:name="_Toc222236761"/>
       <w:r>
         <w:t xml:space="preserve">Abbildung </w:t>
       </w:r>
@@ -4145,7 +4393,8 @@
         </w:rPr>
         <w:t xml:space="preserve"> LED-Driver</w:t>
       </w:r>
-      <w:bookmarkEnd w:id="10"/>
+      <w:bookmarkEnd w:id="15"/>
+      <w:bookmarkEnd w:id="16"/>
     </w:p>
     <w:p>
       <w:r>
@@ -4222,7 +4471,8 @@
       <w:pPr>
         <w:pStyle w:val="Beschriftung"/>
       </w:pPr>
-      <w:bookmarkStart w:id="11" w:name="_Toc198107279"/>
+      <w:bookmarkStart w:id="17" w:name="_Toc222227737"/>
+      <w:bookmarkStart w:id="18" w:name="_Toc222236762"/>
       <w:r>
         <w:t xml:space="preserve">Abbildung </w:t>
       </w:r>
@@ -4240,7 +4490,8 @@
         </w:rPr>
         <w:t xml:space="preserve"> Mikrofon</w:t>
       </w:r>
-      <w:bookmarkEnd w:id="11"/>
+      <w:bookmarkEnd w:id="17"/>
+      <w:bookmarkEnd w:id="18"/>
     </w:p>
     <w:p>
       <w:r>
@@ -4353,7 +4604,8 @@
       <w:pPr>
         <w:pStyle w:val="Beschriftung"/>
       </w:pPr>
-      <w:bookmarkStart w:id="12" w:name="_Toc198107280"/>
+      <w:bookmarkStart w:id="19" w:name="_Toc222227738"/>
+      <w:bookmarkStart w:id="20" w:name="_Toc222236763"/>
       <w:r>
         <w:t xml:space="preserve">Abbildung </w:t>
       </w:r>
@@ -4371,7 +4623,8 @@
         </w:rPr>
         <w:t xml:space="preserve"> Carrierboard</w:t>
       </w:r>
-      <w:bookmarkEnd w:id="12"/>
+      <w:bookmarkEnd w:id="19"/>
+      <w:bookmarkEnd w:id="20"/>
     </w:p>
     <w:p>
       <w:r>
@@ -4495,7 +4748,8 @@
       <w:pPr>
         <w:pStyle w:val="Beschriftung"/>
       </w:pPr>
-      <w:bookmarkStart w:id="13" w:name="_Toc198107281"/>
+      <w:bookmarkStart w:id="21" w:name="_Toc222227739"/>
+      <w:bookmarkStart w:id="22" w:name="_Toc222236764"/>
       <w:r>
         <w:t xml:space="preserve">Abbildung </w:t>
       </w:r>
@@ -4513,7 +4767,8 @@
         </w:rPr>
         <w:t xml:space="preserve"> ESP32</w:t>
       </w:r>
-      <w:bookmarkEnd w:id="13"/>
+      <w:bookmarkEnd w:id="21"/>
+      <w:bookmarkEnd w:id="22"/>
     </w:p>
     <w:p>
       <w:r>
@@ -4628,7 +4883,8 @@
           <w:bCs/>
         </w:rPr>
       </w:pPr>
-      <w:bookmarkStart w:id="14" w:name="_Toc198107282"/>
+      <w:bookmarkStart w:id="23" w:name="_Toc222227740"/>
+      <w:bookmarkStart w:id="24" w:name="_Toc222236765"/>
       <w:r>
         <w:t xml:space="preserve">Abbildung </w:t>
       </w:r>
@@ -4646,7 +4902,8 @@
         </w:rPr>
         <w:t xml:space="preserve"> Qwiic Knopf</w:t>
       </w:r>
-      <w:bookmarkEnd w:id="14"/>
+      <w:bookmarkEnd w:id="23"/>
+      <w:bookmarkEnd w:id="24"/>
     </w:p>
     <w:p>
       <w:pPr>
@@ -4782,7 +5039,8 @@
       <w:pPr>
         <w:pStyle w:val="Beschriftung"/>
       </w:pPr>
-      <w:bookmarkStart w:id="15" w:name="_Toc198107283"/>
+      <w:bookmarkStart w:id="25" w:name="_Toc222227741"/>
+      <w:bookmarkStart w:id="26" w:name="_Toc222236766"/>
       <w:r>
         <w:t xml:space="preserve">Abbildung </w:t>
       </w:r>
@@ -4797,7 +5055,8 @@
       <w:r>
         <w:t xml:space="preserve"> DIP300-SOIC-16N</w:t>
       </w:r>
-      <w:bookmarkEnd w:id="15"/>
+      <w:bookmarkEnd w:id="25"/>
+      <w:bookmarkEnd w:id="26"/>
     </w:p>
     <w:p>
       <w:r>
@@ -4894,7 +5153,8 @@
       <w:pPr>
         <w:pStyle w:val="Beschriftung"/>
       </w:pPr>
-      <w:bookmarkStart w:id="16" w:name="_Toc198107284"/>
+      <w:bookmarkStart w:id="27" w:name="_Toc222227742"/>
+      <w:bookmarkStart w:id="28" w:name="_Toc222236767"/>
       <w:r>
         <w:t xml:space="preserve">Abbildung </w:t>
       </w:r>
@@ -4912,7 +5172,8 @@
       <w:r>
         <w:t>HRS-1B-07-GA</w:t>
       </w:r>
-      <w:bookmarkEnd w:id="16"/>
+      <w:bookmarkEnd w:id="27"/>
+      <w:bookmarkEnd w:id="28"/>
     </w:p>
     <w:p>
       <w:r>
@@ -4926,18 +5187,18 @@
       <w:pPr>
         <w:pStyle w:val="berschrift3"/>
       </w:pPr>
-      <w:bookmarkStart w:id="17" w:name="_Toc207105983"/>
+      <w:bookmarkStart w:id="29" w:name="_Toc222230586"/>
       <w:r>
         <w:t>Pins</w:t>
       </w:r>
-      <w:bookmarkEnd w:id="17"/>
+      <w:bookmarkEnd w:id="29"/>
     </w:p>
     <w:p>
       <w:pPr>
         <w:pStyle w:val="Beschriftung"/>
         <w:keepNext/>
       </w:pPr>
-      <w:bookmarkStart w:id="18" w:name="_Toc198107293"/>
+      <w:bookmarkStart w:id="30" w:name="_Toc198107293"/>
       <w:r>
         <w:t xml:space="preserve">Tabelle </w:t>
       </w:r>
@@ -4955,7 +5216,7 @@
         </w:rPr>
         <w:t xml:space="preserve"> Pin Beschreibungen</w:t>
       </w:r>
-      <w:bookmarkEnd w:id="18"/>
+      <w:bookmarkEnd w:id="30"/>
     </w:p>
     <w:tbl>
       <w:tblPr>
@@ -5239,7 +5500,7 @@
               <w:t xml:space="preserve">(CLOCK) </w:t>
             </w:r>
             <w:r>
-              <w:t>Besagt wann ein Pixel HIGH oder LOW geschrieben wird.</w:t>
+              <w:t>Schiebt nach einem Zyklus (von 0 auf 1 auf 0) den Wert von DA weiter.</w:t>
             </w:r>
           </w:p>
         </w:tc>
@@ -5267,7 +5528,10 @@
               <w:t xml:space="preserve">(LATCH) </w:t>
             </w:r>
             <w:r>
-              <w:t>Schiebt den LED-Buffer eine Reihe weiter</w:t>
+              <w:t>Wenn Latch HIGH ist, werden</w:t>
+            </w:r>
+            <w:r>
+              <w:t xml:space="preserve"> die Änderungen am Screen angezeigt</w:t>
             </w:r>
           </w:p>
         </w:tc>
@@ -5344,31 +5608,22 @@
       <w:pPr>
         <w:pStyle w:val="berschrift2"/>
       </w:pPr>
-      <w:bookmarkStart w:id="19" w:name="_Toc207105984"/>
+      <w:bookmarkStart w:id="31" w:name="_Toc222230587"/>
       <w:r>
         <w:lastRenderedPageBreak/>
         <w:t>Planen</w:t>
       </w:r>
-      <w:bookmarkEnd w:id="19"/>
+      <w:bookmarkEnd w:id="31"/>
     </w:p>
     <w:p>
       <w:pPr>
         <w:pStyle w:val="berschrift3"/>
       </w:pPr>
-      <w:bookmarkStart w:id="20" w:name="_Toc207105985"/>
-      <w:r>
-        <w:t xml:space="preserve">LED-Box </w:t>
-      </w:r>
-      <w:r>
-        <w:t>Verbind</w:t>
-      </w:r>
-      <w:r>
-        <w:t>en</w:t>
-      </w:r>
-      <w:r>
-        <w:t xml:space="preserve"> mit dem ESP32</w:t>
-      </w:r>
-      <w:bookmarkEnd w:id="20"/>
+      <w:bookmarkStart w:id="32" w:name="_Toc222230588"/>
+      <w:r>
+        <w:t>LED-Box Verbinden mit dem ESP32</w:t>
+      </w:r>
+      <w:bookmarkEnd w:id="32"/>
     </w:p>
     <w:p>
       <w:r>
@@ -5424,30 +5679,24 @@
       <w:pPr>
         <w:pStyle w:val="Beschriftung"/>
       </w:pPr>
+      <w:bookmarkStart w:id="33" w:name="_Toc222227743"/>
+      <w:bookmarkStart w:id="34" w:name="_Toc222236768"/>
       <w:r>
         <w:t xml:space="preserve">Abbildung </w:t>
       </w:r>
-      <w:r>
-        <w:fldChar w:fldCharType="begin"/>
-      </w:r>
-      <w:r>
-        <w:instrText xml:space="preserve"> SEQ Abbildung \* ARABIC </w:instrText>
-      </w:r>
-      <w:r>
-        <w:fldChar w:fldCharType="separate"/>
-      </w:r>
-      <w:r>
-        <w:rPr>
-          <w:noProof/>
-        </w:rPr>
-        <w:t>13</w:t>
-      </w:r>
-      <w:r>
-        <w:fldChar w:fldCharType="end"/>
-      </w:r>
+      <w:fldSimple w:instr=" SEQ Abbildung \* ARABIC ">
+        <w:r>
+          <w:rPr>
+            <w:noProof/>
+          </w:rPr>
+          <w:t>13</w:t>
+        </w:r>
+      </w:fldSimple>
       <w:r>
         <w:t xml:space="preserve"> Modifizierter Steckplan</w:t>
       </w:r>
+      <w:bookmarkEnd w:id="33"/>
+      <w:bookmarkEnd w:id="34"/>
     </w:p>
     <w:p>
       <w:r>
@@ -5509,30 +5758,24 @@
       <w:pPr>
         <w:pStyle w:val="Beschriftung"/>
       </w:pPr>
+      <w:bookmarkStart w:id="35" w:name="_Toc222227744"/>
+      <w:bookmarkStart w:id="36" w:name="_Toc222236769"/>
       <w:r>
         <w:t xml:space="preserve">Abbildung </w:t>
       </w:r>
-      <w:r>
-        <w:fldChar w:fldCharType="begin"/>
-      </w:r>
-      <w:r>
-        <w:instrText xml:space="preserve"> SEQ Abbildung \* ARABIC </w:instrText>
-      </w:r>
-      <w:r>
-        <w:fldChar w:fldCharType="separate"/>
-      </w:r>
-      <w:r>
-        <w:rPr>
-          <w:noProof/>
-        </w:rPr>
-        <w:t>14</w:t>
-      </w:r>
-      <w:r>
-        <w:fldChar w:fldCharType="end"/>
-      </w:r>
+      <w:fldSimple w:instr=" SEQ Abbildung \* ARABIC ">
+        <w:r>
+          <w:rPr>
+            <w:noProof/>
+          </w:rPr>
+          <w:t>14</w:t>
+        </w:r>
+      </w:fldSimple>
       <w:r>
         <w:t xml:space="preserve"> Steckplan</w:t>
       </w:r>
+      <w:bookmarkEnd w:id="35"/>
+      <w:bookmarkEnd w:id="36"/>
     </w:p>
     <w:p/>
     <w:p/>
@@ -5541,12 +5784,12 @@
       <w:pPr>
         <w:pStyle w:val="berschrift3"/>
       </w:pPr>
-      <w:bookmarkStart w:id="21" w:name="_Toc207105986"/>
+      <w:bookmarkStart w:id="37" w:name="_Toc222230589"/>
       <w:r>
         <w:lastRenderedPageBreak/>
         <w:t>LED-Matrix Encoding</w:t>
       </w:r>
-      <w:bookmarkEnd w:id="21"/>
+      <w:bookmarkEnd w:id="37"/>
     </w:p>
     <w:p>
       <w:r>
@@ -13774,48 +14017,109 @@
       <w:pPr>
         <w:pStyle w:val="berschrift2"/>
       </w:pPr>
-      <w:bookmarkStart w:id="22" w:name="_Toc207105987"/>
+      <w:bookmarkStart w:id="38" w:name="_Toc222230591"/>
       <w:r>
         <w:t>Entscheiden</w:t>
       </w:r>
-      <w:bookmarkEnd w:id="22"/>
+      <w:bookmarkEnd w:id="38"/>
     </w:p>
     <w:p>
       <w:pPr>
-        <w:pStyle w:val="berschrift2"/>
-      </w:pPr>
-      <w:bookmarkStart w:id="23" w:name="_Toc207105988"/>
-      <w:r>
-        <w:t>Realisieren</w:t>
-      </w:r>
-      <w:bookmarkEnd w:id="23"/>
+        <w:pStyle w:val="berschrift3"/>
+      </w:pPr>
+      <w:bookmarkStart w:id="39" w:name="_Toc222230592"/>
+      <w:r>
+        <w:t>Stückliste</w:t>
+      </w:r>
+      <w:bookmarkEnd w:id="39"/>
     </w:p>
     <w:p>
-      <w:pPr>
-        <w:pStyle w:val="berschrift3"/>
-      </w:pPr>
-      <w:bookmarkStart w:id="24" w:name="_Toc207105989"/>
-      <w:r>
-        <w:t>LED-Box auseinandernehmen</w:t>
-      </w:r>
-      <w:bookmarkEnd w:id="24"/>
+      <w:r>
+        <w:t>Um mit meinem Projekt voranzukommen, muss ich jetzt noch eine Liste mit allen Materialien erstellen, die man beim Erstellen einer EchoPlay Box braucht. Die Stückliste habe nach langer Recherche und Beratung erstellt.</w:t>
+      </w:r>
+      <w:r>
+        <w:t xml:space="preserve"> Was hier noch fehlt sind die Jumperkabel, um den ESP mit der Box zu verbinden, man braucht noch 8 M-M Jumperkabel, um dies zu machen. Was man auch noch machen kann, ist ein längeres Kabel für den Controller zu kaufen oder noch ein zweites mit einem Multi Port zu kaufen.</w:t>
+      </w:r>
     </w:p>
     <w:p>
-      <w:r>
-        <w:t>Zuerst muss man die Schrauben auf der Hinterseite der Box hinausschrauben.</w:t>
-      </w:r>
-    </w:p>
-    <w:p>
-      <w:pPr>
-        <w:keepNext/>
-      </w:pPr>
       <w:r>
         <w:rPr>
           <w:noProof/>
         </w:rPr>
         <w:drawing>
-          <wp:inline distT="0" distB="0" distL="0" distR="0" wp14:anchorId="793AF768" wp14:editId="4A649BED">
-            <wp:extent cx="1908785" cy="1828800"/>
+          <wp:inline distT="0" distB="0" distL="0" distR="0" wp14:anchorId="05808797" wp14:editId="223309AE">
+            <wp:extent cx="6319226" cy="983411"/>
+            <wp:effectExtent l="0" t="0" r="5715" b="7620"/>
+            <wp:docPr id="601032245" name="Grafik 1" descr="Ein Bild, das Text, Schrift, Reihe, Zahl enthält.&#10;&#10;KI-generierte Inhalte können fehlerhaft sein."/>
+            <wp:cNvGraphicFramePr>
+              <a:graphicFrameLocks xmlns:a="http://schemas.openxmlformats.org/drawingml/2006/main" noChangeAspect="1"/>
+            </wp:cNvGraphicFramePr>
+            <a:graphic xmlns:a="http://schemas.openxmlformats.org/drawingml/2006/main">
+              <a:graphicData uri="http://schemas.openxmlformats.org/drawingml/2006/picture">
+                <pic:pic xmlns:pic="http://schemas.openxmlformats.org/drawingml/2006/picture">
+                  <pic:nvPicPr>
+                    <pic:cNvPr id="601032245" name="Grafik 1" descr="Ein Bild, das Text, Schrift, Reihe, Zahl enthält.&#10;&#10;KI-generierte Inhalte können fehlerhaft sein."/>
+                    <pic:cNvPicPr/>
+                  </pic:nvPicPr>
+                  <pic:blipFill>
+                    <a:blip r:embed="rId30"/>
+                    <a:stretch>
+                      <a:fillRect/>
+                    </a:stretch>
+                  </pic:blipFill>
+                  <pic:spPr>
+                    <a:xfrm>
+                      <a:off x="0" y="0"/>
+                      <a:ext cx="6354069" cy="988833"/>
+                    </a:xfrm>
+                    <a:prstGeom prst="rect">
+                      <a:avLst/>
+                    </a:prstGeom>
+                  </pic:spPr>
+                </pic:pic>
+              </a:graphicData>
+            </a:graphic>
+          </wp:inline>
+        </w:drawing>
+      </w:r>
+    </w:p>
+    <w:p>
+      <w:pPr>
+        <w:pStyle w:val="berschrift2"/>
+      </w:pPr>
+      <w:bookmarkStart w:id="40" w:name="_Toc222230593"/>
+      <w:r>
+        <w:t>Realisieren</w:t>
+      </w:r>
+      <w:bookmarkEnd w:id="40"/>
+    </w:p>
+    <w:p>
+      <w:pPr>
+        <w:pStyle w:val="berschrift3"/>
+      </w:pPr>
+      <w:bookmarkStart w:id="41" w:name="_Toc222230594"/>
+      <w:r>
+        <w:t>LED-Box auseinandernehmen</w:t>
+      </w:r>
+      <w:bookmarkEnd w:id="41"/>
+    </w:p>
+    <w:p>
+      <w:r>
+        <w:t>Zuerst muss man die Schrauben auf der Hinterseite der Box hinausschrauben.</w:t>
+      </w:r>
+    </w:p>
+    <w:p>
+      <w:pPr>
+        <w:keepNext/>
+      </w:pPr>
+      <w:r>
+        <w:rPr>
+          <w:noProof/>
+        </w:rPr>
+        <w:lastRenderedPageBreak/>
+        <w:drawing>
+          <wp:inline distT="0" distB="0" distL="0" distR="0" wp14:anchorId="793AF768" wp14:editId="21448524">
+            <wp:extent cx="1755723" cy="1682151"/>
             <wp:effectExtent l="0" t="0" r="0" b="0"/>
             <wp:docPr id="1321196124" name="Grafik 18" descr="Ein Bild, das Text, Elektronik, Screenshot, Design enthält.&#10;&#10;KI-generierte Inhalte können fehlerhaft sein."/>
             <wp:cNvGraphicFramePr>
@@ -13831,7 +14135,7 @@
                     </pic:cNvPicPr>
                   </pic:nvPicPr>
                   <pic:blipFill>
-                    <a:blip r:embed="rId30" cstate="print">
+                    <a:blip r:embed="rId31" cstate="print">
                       <a:extLst>
                         <a:ext uri="{28A0092B-C50C-407E-A947-70E740481C1C}">
                           <a14:useLocalDpi xmlns:a14="http://schemas.microsoft.com/office/drawing/2010/main" val="0"/>
@@ -13846,7 +14150,7 @@
                   <pic:spPr bwMode="auto">
                     <a:xfrm>
                       <a:off x="0" y="0"/>
-                      <a:ext cx="1916672" cy="1836356"/>
+                      <a:ext cx="1780058" cy="1705466"/>
                     </a:xfrm>
                     <a:prstGeom prst="rect">
                       <a:avLst/>
@@ -13867,38 +14171,27 @@
       <w:pPr>
         <w:pStyle w:val="Beschriftung"/>
       </w:pPr>
-      <w:bookmarkStart w:id="25" w:name="_Toc198107285"/>
+      <w:bookmarkStart w:id="42" w:name="_Toc222227745"/>
+      <w:bookmarkStart w:id="43" w:name="_Toc222236770"/>
       <w:r>
         <w:t xml:space="preserve">Abbildung </w:t>
       </w:r>
-      <w:r>
-        <w:fldChar w:fldCharType="begin"/>
-      </w:r>
-      <w:r>
-        <w:instrText xml:space="preserve"> SEQ Abbildung \* ARABIC </w:instrText>
-      </w:r>
-      <w:r>
-        <w:fldChar w:fldCharType="separate"/>
-      </w:r>
-      <w:r>
-        <w:rPr>
-          <w:noProof/>
-        </w:rPr>
-        <w:t>15</w:t>
-      </w:r>
-      <w:r>
-        <w:rPr>
-          <w:noProof/>
-        </w:rPr>
-        <w:fldChar w:fldCharType="end"/>
-      </w:r>
+      <w:fldSimple w:instr=" SEQ Abbildung \* ARABIC ">
+        <w:r>
+          <w:rPr>
+            <w:noProof/>
+          </w:rPr>
+          <w:t>15</w:t>
+        </w:r>
+      </w:fldSimple>
       <w:r>
         <w:rPr>
           <w:noProof/>
         </w:rPr>
         <w:t xml:space="preserve"> LED-Box öffnen 1</w:t>
       </w:r>
-      <w:bookmarkEnd w:id="25"/>
+      <w:bookmarkEnd w:id="42"/>
+      <w:bookmarkEnd w:id="43"/>
     </w:p>
     <w:p>
       <w:r>
@@ -13913,7 +14206,6 @@
         <w:rPr>
           <w:noProof/>
         </w:rPr>
-        <w:lastRenderedPageBreak/>
         <w:drawing>
           <wp:inline distT="0" distB="0" distL="0" distR="0" wp14:anchorId="31657BCC" wp14:editId="10BEC045">
             <wp:extent cx="1908175" cy="1815951"/>
@@ -13932,7 +14224,7 @@
                     </pic:cNvPicPr>
                   </pic:nvPicPr>
                   <pic:blipFill rotWithShape="1">
-                    <a:blip r:embed="rId31" cstate="print">
+                    <a:blip r:embed="rId32" cstate="print">
                       <a:extLst>
                         <a:ext uri="{28A0092B-C50C-407E-A947-70E740481C1C}">
                           <a14:useLocalDpi xmlns:a14="http://schemas.microsoft.com/office/drawing/2010/main" val="0"/>
@@ -13971,38 +14263,27 @@
       <w:pPr>
         <w:pStyle w:val="Beschriftung"/>
       </w:pPr>
-      <w:bookmarkStart w:id="26" w:name="_Toc198107286"/>
+      <w:bookmarkStart w:id="44" w:name="_Toc222227746"/>
+      <w:bookmarkStart w:id="45" w:name="_Toc222236771"/>
       <w:r>
         <w:t xml:space="preserve">Abbildung </w:t>
       </w:r>
-      <w:r>
-        <w:fldChar w:fldCharType="begin"/>
-      </w:r>
-      <w:r>
-        <w:instrText xml:space="preserve"> SEQ Abbildung \* ARABIC </w:instrText>
-      </w:r>
-      <w:r>
-        <w:fldChar w:fldCharType="separate"/>
-      </w:r>
-      <w:r>
-        <w:rPr>
-          <w:noProof/>
-        </w:rPr>
-        <w:t>16</w:t>
-      </w:r>
-      <w:r>
-        <w:rPr>
-          <w:noProof/>
-        </w:rPr>
-        <w:fldChar w:fldCharType="end"/>
-      </w:r>
+      <w:fldSimple w:instr=" SEQ Abbildung \* ARABIC ">
+        <w:r>
+          <w:rPr>
+            <w:noProof/>
+          </w:rPr>
+          <w:t>16</w:t>
+        </w:r>
+      </w:fldSimple>
       <w:r>
         <w:rPr>
           <w:noProof/>
         </w:rPr>
         <w:t xml:space="preserve"> LED-Box öffnen 2</w:t>
       </w:r>
-      <w:bookmarkEnd w:id="26"/>
+      <w:bookmarkEnd w:id="44"/>
+      <w:bookmarkEnd w:id="45"/>
     </w:p>
     <w:p>
       <w:r>
@@ -14035,7 +14316,7 @@
                     </pic:cNvPicPr>
                   </pic:nvPicPr>
                   <pic:blipFill rotWithShape="1">
-                    <a:blip r:embed="rId32" cstate="print">
+                    <a:blip r:embed="rId33" cstate="print">
                       <a:extLst>
                         <a:ext uri="{28A0092B-C50C-407E-A947-70E740481C1C}">
                           <a14:useLocalDpi xmlns:a14="http://schemas.microsoft.com/office/drawing/2010/main" val="0"/>
@@ -14074,38 +14355,27 @@
       <w:pPr>
         <w:pStyle w:val="Beschriftung"/>
       </w:pPr>
-      <w:bookmarkStart w:id="27" w:name="_Toc198107287"/>
+      <w:bookmarkStart w:id="46" w:name="_Toc222227747"/>
+      <w:bookmarkStart w:id="47" w:name="_Toc222236772"/>
       <w:r>
         <w:t xml:space="preserve">Abbildung </w:t>
       </w:r>
-      <w:r>
-        <w:fldChar w:fldCharType="begin"/>
-      </w:r>
-      <w:r>
-        <w:instrText xml:space="preserve"> SEQ Abbildung \* ARABIC </w:instrText>
-      </w:r>
-      <w:r>
-        <w:fldChar w:fldCharType="separate"/>
-      </w:r>
-      <w:r>
-        <w:rPr>
-          <w:noProof/>
-        </w:rPr>
-        <w:t>17</w:t>
-      </w:r>
-      <w:r>
-        <w:rPr>
-          <w:noProof/>
-        </w:rPr>
-        <w:fldChar w:fldCharType="end"/>
-      </w:r>
+      <w:fldSimple w:instr=" SEQ Abbildung \* ARABIC ">
+        <w:r>
+          <w:rPr>
+            <w:noProof/>
+          </w:rPr>
+          <w:t>17</w:t>
+        </w:r>
+      </w:fldSimple>
       <w:r>
         <w:rPr>
           <w:noProof/>
         </w:rPr>
         <w:t xml:space="preserve"> LED-Box öffnen 3</w:t>
       </w:r>
-      <w:bookmarkEnd w:id="27"/>
+      <w:bookmarkEnd w:id="46"/>
+      <w:bookmarkEnd w:id="47"/>
     </w:p>
     <w:p>
       <w:r>
@@ -14144,7 +14414,7 @@
                     </pic:cNvPicPr>
                   </pic:nvPicPr>
                   <pic:blipFill rotWithShape="1">
-                    <a:blip r:embed="rId33" cstate="print">
+                    <a:blip r:embed="rId34" cstate="print">
                       <a:extLst>
                         <a:ext uri="{28A0092B-C50C-407E-A947-70E740481C1C}">
                           <a14:useLocalDpi xmlns:a14="http://schemas.microsoft.com/office/drawing/2010/main" val="0"/>
@@ -14183,41 +14453,31 @@
       <w:pPr>
         <w:pStyle w:val="Beschriftung"/>
       </w:pPr>
-      <w:bookmarkStart w:id="28" w:name="_Toc198107288"/>
+      <w:bookmarkStart w:id="48" w:name="_Toc222227748"/>
+      <w:bookmarkStart w:id="49" w:name="_Toc222236773"/>
       <w:r>
         <w:t xml:space="preserve">Abbildung </w:t>
       </w:r>
-      <w:r>
-        <w:fldChar w:fldCharType="begin"/>
-      </w:r>
-      <w:r>
-        <w:instrText xml:space="preserve"> SEQ Abbildung \* ARABIC </w:instrText>
-      </w:r>
-      <w:r>
-        <w:fldChar w:fldCharType="separate"/>
-      </w:r>
-      <w:r>
-        <w:rPr>
-          <w:noProof/>
-        </w:rPr>
-        <w:t>18</w:t>
-      </w:r>
-      <w:r>
-        <w:rPr>
-          <w:noProof/>
-        </w:rPr>
-        <w:fldChar w:fldCharType="end"/>
-      </w:r>
+      <w:fldSimple w:instr=" SEQ Abbildung \* ARABIC ">
+        <w:r>
+          <w:rPr>
+            <w:noProof/>
+          </w:rPr>
+          <w:t>18</w:t>
+        </w:r>
+      </w:fldSimple>
       <w:r>
         <w:rPr>
           <w:noProof/>
         </w:rPr>
         <w:t xml:space="preserve"> LED-Box öffnen 4</w:t>
       </w:r>
-      <w:bookmarkEnd w:id="28"/>
+      <w:bookmarkEnd w:id="48"/>
+      <w:bookmarkEnd w:id="49"/>
     </w:p>
     <w:p>
       <w:r>
+        <w:lastRenderedPageBreak/>
         <w:t>Wenn dies erledigt, muss man alle anderen Hebel in den Ecken entfernen.</w:t>
       </w:r>
     </w:p>
@@ -14229,7 +14489,6 @@
         <w:rPr>
           <w:noProof/>
         </w:rPr>
-        <w:lastRenderedPageBreak/>
         <w:drawing>
           <wp:inline distT="0" distB="0" distL="0" distR="0" wp14:anchorId="137BCD9D" wp14:editId="1B3E3D1B">
             <wp:extent cx="2537460" cy="1931213"/>
@@ -14248,7 +14507,7 @@
                     </pic:cNvPicPr>
                   </pic:nvPicPr>
                   <pic:blipFill rotWithShape="1">
-                    <a:blip r:embed="rId34" cstate="print">
+                    <a:blip r:embed="rId35" cstate="print">
                       <a:extLst>
                         <a:ext uri="{28A0092B-C50C-407E-A947-70E740481C1C}">
                           <a14:useLocalDpi xmlns:a14="http://schemas.microsoft.com/office/drawing/2010/main" val="0"/>
@@ -14287,38 +14546,27 @@
       <w:pPr>
         <w:pStyle w:val="Beschriftung"/>
       </w:pPr>
-      <w:bookmarkStart w:id="29" w:name="_Toc198107289"/>
+      <w:bookmarkStart w:id="50" w:name="_Toc222227749"/>
+      <w:bookmarkStart w:id="51" w:name="_Toc222236774"/>
       <w:r>
         <w:t xml:space="preserve">Abbildung </w:t>
       </w:r>
-      <w:r>
-        <w:fldChar w:fldCharType="begin"/>
-      </w:r>
-      <w:r>
-        <w:instrText xml:space="preserve"> SEQ Abbildung \* ARABIC </w:instrText>
-      </w:r>
-      <w:r>
-        <w:fldChar w:fldCharType="separate"/>
-      </w:r>
-      <w:r>
-        <w:rPr>
-          <w:noProof/>
-        </w:rPr>
-        <w:t>19</w:t>
-      </w:r>
-      <w:r>
-        <w:rPr>
-          <w:noProof/>
-        </w:rPr>
-        <w:fldChar w:fldCharType="end"/>
-      </w:r>
+      <w:fldSimple w:instr=" SEQ Abbildung \* ARABIC ">
+        <w:r>
+          <w:rPr>
+            <w:noProof/>
+          </w:rPr>
+          <w:t>19</w:t>
+        </w:r>
+      </w:fldSimple>
       <w:r>
         <w:rPr>
           <w:noProof/>
         </w:rPr>
         <w:t xml:space="preserve"> LED-Box öffnen 5</w:t>
       </w:r>
-      <w:bookmarkEnd w:id="29"/>
+      <w:bookmarkEnd w:id="50"/>
+      <w:bookmarkEnd w:id="51"/>
     </w:p>
     <w:p>
       <w:r>
@@ -14351,7 +14599,7 @@
                     </pic:cNvPicPr>
                   </pic:nvPicPr>
                   <pic:blipFill>
-                    <a:blip r:embed="rId35" cstate="print">
+                    <a:blip r:embed="rId36" cstate="print">
                       <a:extLst>
                         <a:ext uri="{28A0092B-C50C-407E-A947-70E740481C1C}">
                           <a14:useLocalDpi xmlns:a14="http://schemas.microsoft.com/office/drawing/2010/main" val="0"/>
@@ -14404,7 +14652,7 @@
                     </pic:cNvPicPr>
                   </pic:nvPicPr>
                   <pic:blipFill>
-                    <a:blip r:embed="rId36" cstate="print">
+                    <a:blip r:embed="rId37" cstate="print">
                       <a:extLst>
                         <a:ext uri="{28A0092B-C50C-407E-A947-70E740481C1C}">
                           <a14:useLocalDpi xmlns:a14="http://schemas.microsoft.com/office/drawing/2010/main" val="0"/>
@@ -14457,7 +14705,7 @@
                     </pic:cNvPicPr>
                   </pic:nvPicPr>
                   <pic:blipFill>
-                    <a:blip r:embed="rId37" cstate="print">
+                    <a:blip r:embed="rId38" cstate="print">
                       <a:extLst>
                         <a:ext uri="{28A0092B-C50C-407E-A947-70E740481C1C}">
                           <a14:useLocalDpi xmlns:a14="http://schemas.microsoft.com/office/drawing/2010/main" val="0"/>
@@ -14493,38 +14741,27 @@
       <w:pPr>
         <w:pStyle w:val="Beschriftung"/>
       </w:pPr>
-      <w:bookmarkStart w:id="30" w:name="_Toc198107290"/>
+      <w:bookmarkStart w:id="52" w:name="_Toc222227750"/>
+      <w:bookmarkStart w:id="53" w:name="_Toc222236775"/>
       <w:r>
         <w:t xml:space="preserve">Abbildung </w:t>
       </w:r>
-      <w:r>
-        <w:fldChar w:fldCharType="begin"/>
-      </w:r>
-      <w:r>
-        <w:instrText xml:space="preserve"> SEQ Abbildung \* ARABIC </w:instrText>
-      </w:r>
-      <w:r>
-        <w:fldChar w:fldCharType="separate"/>
-      </w:r>
-      <w:r>
-        <w:rPr>
-          <w:noProof/>
-        </w:rPr>
-        <w:t>20</w:t>
-      </w:r>
-      <w:r>
-        <w:rPr>
-          <w:noProof/>
-        </w:rPr>
-        <w:fldChar w:fldCharType="end"/>
-      </w:r>
+      <w:fldSimple w:instr=" SEQ Abbildung \* ARABIC ">
+        <w:r>
+          <w:rPr>
+            <w:noProof/>
+          </w:rPr>
+          <w:t>20</w:t>
+        </w:r>
+      </w:fldSimple>
       <w:r>
         <w:rPr>
           <w:noProof/>
         </w:rPr>
         <w:t xml:space="preserve"> LED-Box öffnen 6</w:t>
       </w:r>
-      <w:bookmarkEnd w:id="30"/>
+      <w:bookmarkEnd w:id="52"/>
+      <w:bookmarkEnd w:id="53"/>
     </w:p>
     <w:p>
       <w:r>
@@ -14540,9 +14777,9 @@
           <w:noProof/>
         </w:rPr>
         <w:drawing>
-          <wp:inline distT="0" distB="0" distL="0" distR="0" wp14:anchorId="0D603592" wp14:editId="3EF3E506">
-            <wp:extent cx="1382573" cy="1842397"/>
-            <wp:effectExtent l="0" t="0" r="8255" b="5715"/>
+          <wp:inline distT="0" distB="0" distL="0" distR="0" wp14:anchorId="0D603592" wp14:editId="1D49839A">
+            <wp:extent cx="1270394" cy="1692910"/>
+            <wp:effectExtent l="0" t="0" r="6350" b="2540"/>
             <wp:docPr id="2085664336" name="Grafik 26" descr="Ein Bild, das Elektronik, Maschine, Elektrische Leitungen, Elektrisches Bauelement enthält.&#10;&#10;KI-generierte Inhalte können fehlerhaft sein."/>
             <wp:cNvGraphicFramePr>
               <a:graphicFrameLocks xmlns:a="http://schemas.openxmlformats.org/drawingml/2006/main" noChangeAspect="1"/>
@@ -14552,112 +14789,6 @@
                 <pic:pic xmlns:pic="http://schemas.openxmlformats.org/drawingml/2006/picture">
                   <pic:nvPicPr>
                     <pic:cNvPr id="2085664336" name="Grafik 26" descr="Ein Bild, das Elektronik, Maschine, Elektrische Leitungen, Elektrisches Bauelement enthält.&#10;&#10;KI-generierte Inhalte können fehlerhaft sein."/>
-                    <pic:cNvPicPr>
-                      <a:picLocks noChangeAspect="1" noChangeArrowheads="1"/>
-                    </pic:cNvPicPr>
-                  </pic:nvPicPr>
-                  <pic:blipFill>
-                    <a:blip r:embed="rId36" cstate="print">
-                      <a:extLst>
-                        <a:ext uri="{28A0092B-C50C-407E-A947-70E740481C1C}">
-                          <a14:useLocalDpi xmlns:a14="http://schemas.microsoft.com/office/drawing/2010/main" val="0"/>
-                        </a:ext>
-                      </a:extLst>
-                    </a:blip>
-                    <a:srcRect/>
-                    <a:stretch>
-                      <a:fillRect/>
-                    </a:stretch>
-                  </pic:blipFill>
-                  <pic:spPr bwMode="auto">
-                    <a:xfrm>
-                      <a:off x="0" y="0"/>
-                      <a:ext cx="1394563" cy="1858375"/>
-                    </a:xfrm>
-                    <a:prstGeom prst="rect">
-                      <a:avLst/>
-                    </a:prstGeom>
-                    <a:noFill/>
-                    <a:ln>
-                      <a:noFill/>
-                    </a:ln>
-                  </pic:spPr>
-                </pic:pic>
-              </a:graphicData>
-            </a:graphic>
-          </wp:inline>
-        </w:drawing>
-      </w:r>
-      <w:r>
-        <w:rPr>
-          <w:noProof/>
-        </w:rPr>
-        <w:drawing>
-          <wp:inline distT="0" distB="0" distL="0" distR="0" wp14:anchorId="2DA5FFDB" wp14:editId="545544E1">
-            <wp:extent cx="1377859" cy="1836115"/>
-            <wp:effectExtent l="0" t="0" r="0" b="0"/>
-            <wp:docPr id="453027667" name="Grafik 28"/>
-            <wp:cNvGraphicFramePr>
-              <a:graphicFrameLocks xmlns:a="http://schemas.openxmlformats.org/drawingml/2006/main" noChangeAspect="1"/>
-            </wp:cNvGraphicFramePr>
-            <a:graphic xmlns:a="http://schemas.openxmlformats.org/drawingml/2006/main">
-              <a:graphicData uri="http://schemas.openxmlformats.org/drawingml/2006/picture">
-                <pic:pic xmlns:pic="http://schemas.openxmlformats.org/drawingml/2006/picture">
-                  <pic:nvPicPr>
-                    <pic:cNvPr id="0" name="Picture 19"/>
-                    <pic:cNvPicPr>
-                      <a:picLocks noChangeAspect="1" noChangeArrowheads="1"/>
-                    </pic:cNvPicPr>
-                  </pic:nvPicPr>
-                  <pic:blipFill>
-                    <a:blip r:embed="rId38" cstate="print">
-                      <a:extLst>
-                        <a:ext uri="{28A0092B-C50C-407E-A947-70E740481C1C}">
-                          <a14:useLocalDpi xmlns:a14="http://schemas.microsoft.com/office/drawing/2010/main" val="0"/>
-                        </a:ext>
-                      </a:extLst>
-                    </a:blip>
-                    <a:srcRect/>
-                    <a:stretch>
-                      <a:fillRect/>
-                    </a:stretch>
-                  </pic:blipFill>
-                  <pic:spPr bwMode="auto">
-                    <a:xfrm>
-                      <a:off x="0" y="0"/>
-                      <a:ext cx="1386573" cy="1847728"/>
-                    </a:xfrm>
-                    <a:prstGeom prst="rect">
-                      <a:avLst/>
-                    </a:prstGeom>
-                    <a:noFill/>
-                    <a:ln>
-                      <a:noFill/>
-                    </a:ln>
-                  </pic:spPr>
-                </pic:pic>
-              </a:graphicData>
-            </a:graphic>
-          </wp:inline>
-        </w:drawing>
-      </w:r>
-      <w:r>
-        <w:rPr>
-          <w:noProof/>
-        </w:rPr>
-        <w:drawing>
-          <wp:inline distT="0" distB="0" distL="0" distR="0" wp14:anchorId="66406126" wp14:editId="58CAF93D">
-            <wp:extent cx="1375257" cy="1832647"/>
-            <wp:effectExtent l="0" t="0" r="0" b="0"/>
-            <wp:docPr id="202312289" name="Grafik 29" descr="Ein Bild, das Im Haus enthält.&#10;&#10;KI-generierte Inhalte können fehlerhaft sein."/>
-            <wp:cNvGraphicFramePr>
-              <a:graphicFrameLocks xmlns:a="http://schemas.openxmlformats.org/drawingml/2006/main" noChangeAspect="1"/>
-            </wp:cNvGraphicFramePr>
-            <a:graphic xmlns:a="http://schemas.openxmlformats.org/drawingml/2006/main">
-              <a:graphicData uri="http://schemas.openxmlformats.org/drawingml/2006/picture">
-                <pic:pic xmlns:pic="http://schemas.openxmlformats.org/drawingml/2006/picture">
-                  <pic:nvPicPr>
-                    <pic:cNvPr id="202312289" name="Grafik 29" descr="Ein Bild, das Im Haus enthält.&#10;&#10;KI-generierte Inhalte können fehlerhaft sein."/>
                     <pic:cNvPicPr>
                       <a:picLocks noChangeAspect="1" noChangeArrowheads="1"/>
                     </pic:cNvPicPr>
@@ -14678,7 +14809,7 @@
                   <pic:spPr bwMode="auto">
                     <a:xfrm>
                       <a:off x="0" y="0"/>
-                      <a:ext cx="1388883" cy="1850805"/>
+                      <a:ext cx="1283048" cy="1709772"/>
                     </a:xfrm>
                     <a:prstGeom prst="rect">
                       <a:avLst/>
@@ -14699,10 +14830,10 @@
           <w:noProof/>
         </w:rPr>
         <w:drawing>
-          <wp:inline distT="0" distB="0" distL="0" distR="0" wp14:anchorId="644DA9D7" wp14:editId="7DC881AF">
-            <wp:extent cx="1375258" cy="1834806"/>
-            <wp:effectExtent l="0" t="0" r="0" b="0"/>
-            <wp:docPr id="389371196" name="Grafik 30" descr="Ein Bild, das Metallwaren, Schraube, Im Haus, Nagel enthält.&#10;&#10;KI-generierte Inhalte können fehlerhaft sein."/>
+          <wp:inline distT="0" distB="0" distL="0" distR="0" wp14:anchorId="2DA5FFDB" wp14:editId="3B33A589">
+            <wp:extent cx="1268794" cy="1690778"/>
+            <wp:effectExtent l="0" t="0" r="7620" b="5080"/>
+            <wp:docPr id="453027667" name="Grafik 28"/>
             <wp:cNvGraphicFramePr>
               <a:graphicFrameLocks xmlns:a="http://schemas.openxmlformats.org/drawingml/2006/main" noChangeAspect="1"/>
             </wp:cNvGraphicFramePr>
@@ -14710,7 +14841,7 @@
               <a:graphicData uri="http://schemas.openxmlformats.org/drawingml/2006/picture">
                 <pic:pic xmlns:pic="http://schemas.openxmlformats.org/drawingml/2006/picture">
                   <pic:nvPicPr>
-                    <pic:cNvPr id="389371196" name="Grafik 30" descr="Ein Bild, das Metallwaren, Schraube, Im Haus, Nagel enthält.&#10;&#10;KI-generierte Inhalte können fehlerhaft sein."/>
+                    <pic:cNvPr id="0" name="Picture 19"/>
                     <pic:cNvPicPr>
                       <a:picLocks noChangeAspect="1" noChangeArrowheads="1"/>
                     </pic:cNvPicPr>
@@ -14731,7 +14862,7 @@
                   <pic:spPr bwMode="auto">
                     <a:xfrm>
                       <a:off x="0" y="0"/>
-                      <a:ext cx="1393325" cy="1858911"/>
+                      <a:ext cx="1279279" cy="1704750"/>
                     </a:xfrm>
                     <a:prstGeom prst="rect">
                       <a:avLst/>
@@ -14752,10 +14883,10 @@
           <w:noProof/>
         </w:rPr>
         <w:drawing>
-          <wp:inline distT="0" distB="0" distL="0" distR="0" wp14:anchorId="5A814051" wp14:editId="1023FF54">
-            <wp:extent cx="1845928" cy="1384545"/>
-            <wp:effectExtent l="1905" t="0" r="4445" b="4445"/>
-            <wp:docPr id="1784537496" name="Grafik 31" descr="Ein Bild, das Silber enthält.&#10;&#10;KI-generierte Inhalte können fehlerhaft sein."/>
+          <wp:inline distT="0" distB="0" distL="0" distR="0" wp14:anchorId="66406126" wp14:editId="42F7823D">
+            <wp:extent cx="1257935" cy="1676307"/>
+            <wp:effectExtent l="0" t="0" r="0" b="635"/>
+            <wp:docPr id="202312289" name="Grafik 29" descr="Ein Bild, das Im Haus enthält.&#10;&#10;KI-generierte Inhalte können fehlerhaft sein."/>
             <wp:cNvGraphicFramePr>
               <a:graphicFrameLocks xmlns:a="http://schemas.openxmlformats.org/drawingml/2006/main" noChangeAspect="1"/>
             </wp:cNvGraphicFramePr>
@@ -14763,7 +14894,7 @@
               <a:graphicData uri="http://schemas.openxmlformats.org/drawingml/2006/picture">
                 <pic:pic xmlns:pic="http://schemas.openxmlformats.org/drawingml/2006/picture">
                   <pic:nvPicPr>
-                    <pic:cNvPr id="1784537496" name="Grafik 31" descr="Ein Bild, das Silber enthält.&#10;&#10;KI-generierte Inhalte können fehlerhaft sein."/>
+                    <pic:cNvPr id="202312289" name="Grafik 29" descr="Ein Bild, das Im Haus enthält.&#10;&#10;KI-generierte Inhalte können fehlerhaft sein."/>
                     <pic:cNvPicPr>
                       <a:picLocks noChangeAspect="1" noChangeArrowheads="1"/>
                     </pic:cNvPicPr>
@@ -14782,9 +14913,9 @@
                     </a:stretch>
                   </pic:blipFill>
                   <pic:spPr bwMode="auto">
-                    <a:xfrm rot="5400000">
+                    <a:xfrm>
                       <a:off x="0" y="0"/>
-                      <a:ext cx="1861685" cy="1396364"/>
+                      <a:ext cx="1274243" cy="1698039"/>
                     </a:xfrm>
                     <a:prstGeom prst="rect">
                       <a:avLst/>
@@ -14805,10 +14936,10 @@
           <w:noProof/>
         </w:rPr>
         <w:drawing>
-          <wp:inline distT="0" distB="0" distL="0" distR="0" wp14:anchorId="4E54AC2C" wp14:editId="215DEEBA">
-            <wp:extent cx="1375258" cy="1832648"/>
+          <wp:inline distT="0" distB="0" distL="0" distR="0" wp14:anchorId="644DA9D7" wp14:editId="4615D549">
+            <wp:extent cx="1245104" cy="1661160"/>
             <wp:effectExtent l="0" t="0" r="0" b="0"/>
-            <wp:docPr id="1039759809" name="Grafik 32" descr="Ein Bild, das Waschbecken, Metall, Küchenutensilien, Im Haus enthält.&#10;&#10;KI-generierte Inhalte können fehlerhaft sein."/>
+            <wp:docPr id="389371196" name="Grafik 30" descr="Ein Bild, das Metallwaren, Schraube, Im Haus, Nagel enthält.&#10;&#10;KI-generierte Inhalte können fehlerhaft sein."/>
             <wp:cNvGraphicFramePr>
               <a:graphicFrameLocks xmlns:a="http://schemas.openxmlformats.org/drawingml/2006/main" noChangeAspect="1"/>
             </wp:cNvGraphicFramePr>
@@ -14816,7 +14947,7 @@
               <a:graphicData uri="http://schemas.openxmlformats.org/drawingml/2006/picture">
                 <pic:pic xmlns:pic="http://schemas.openxmlformats.org/drawingml/2006/picture">
                   <pic:nvPicPr>
-                    <pic:cNvPr id="1039759809" name="Grafik 32" descr="Ein Bild, das Waschbecken, Metall, Küchenutensilien, Im Haus enthält.&#10;&#10;KI-generierte Inhalte können fehlerhaft sein."/>
+                    <pic:cNvPr id="389371196" name="Grafik 30" descr="Ein Bild, das Metallwaren, Schraube, Im Haus, Nagel enthält.&#10;&#10;KI-generierte Inhalte können fehlerhaft sein."/>
                     <pic:cNvPicPr>
                       <a:picLocks noChangeAspect="1" noChangeArrowheads="1"/>
                     </pic:cNvPicPr>
@@ -14837,7 +14968,7 @@
                   <pic:spPr bwMode="auto">
                     <a:xfrm>
                       <a:off x="0" y="0"/>
-                      <a:ext cx="1380080" cy="1839073"/>
+                      <a:ext cx="1275047" cy="1701109"/>
                     </a:xfrm>
                     <a:prstGeom prst="rect">
                       <a:avLst/>
@@ -14853,11 +14984,119 @@
           </wp:inline>
         </w:drawing>
       </w:r>
+      <w:r>
+        <w:rPr>
+          <w:noProof/>
+        </w:rPr>
+        <w:drawing>
+          <wp:inline distT="0" distB="0" distL="0" distR="0" wp14:anchorId="5A814051" wp14:editId="208C3A83">
+            <wp:extent cx="1595514" cy="1196722"/>
+            <wp:effectExtent l="8890" t="0" r="0" b="0"/>
+            <wp:docPr id="1784537496" name="Grafik 31" descr="Ein Bild, das Silber enthält.&#10;&#10;KI-generierte Inhalte können fehlerhaft sein."/>
+            <wp:cNvGraphicFramePr>
+              <a:graphicFrameLocks xmlns:a="http://schemas.openxmlformats.org/drawingml/2006/main" noChangeAspect="1"/>
+            </wp:cNvGraphicFramePr>
+            <a:graphic xmlns:a="http://schemas.openxmlformats.org/drawingml/2006/main">
+              <a:graphicData uri="http://schemas.openxmlformats.org/drawingml/2006/picture">
+                <pic:pic xmlns:pic="http://schemas.openxmlformats.org/drawingml/2006/picture">
+                  <pic:nvPicPr>
+                    <pic:cNvPr id="1784537496" name="Grafik 31" descr="Ein Bild, das Silber enthält.&#10;&#10;KI-generierte Inhalte können fehlerhaft sein."/>
+                    <pic:cNvPicPr>
+                      <a:picLocks noChangeAspect="1" noChangeArrowheads="1"/>
+                    </pic:cNvPicPr>
+                  </pic:nvPicPr>
+                  <pic:blipFill>
+                    <a:blip r:embed="rId43" cstate="print">
+                      <a:extLst>
+                        <a:ext uri="{28A0092B-C50C-407E-A947-70E740481C1C}">
+                          <a14:useLocalDpi xmlns:a14="http://schemas.microsoft.com/office/drawing/2010/main" val="0"/>
+                        </a:ext>
+                      </a:extLst>
+                    </a:blip>
+                    <a:srcRect/>
+                    <a:stretch>
+                      <a:fillRect/>
+                    </a:stretch>
+                  </pic:blipFill>
+                  <pic:spPr bwMode="auto">
+                    <a:xfrm rot="5400000">
+                      <a:off x="0" y="0"/>
+                      <a:ext cx="1649397" cy="1237137"/>
+                    </a:xfrm>
+                    <a:prstGeom prst="rect">
+                      <a:avLst/>
+                    </a:prstGeom>
+                    <a:noFill/>
+                    <a:ln>
+                      <a:noFill/>
+                    </a:ln>
+                  </pic:spPr>
+                </pic:pic>
+              </a:graphicData>
+            </a:graphic>
+          </wp:inline>
+        </w:drawing>
+      </w:r>
+      <w:r>
+        <w:rPr>
+          <w:noProof/>
+        </w:rPr>
+        <w:drawing>
+          <wp:inline distT="0" distB="0" distL="0" distR="0" wp14:anchorId="4E54AC2C" wp14:editId="40769704">
+            <wp:extent cx="1198122" cy="1596599"/>
+            <wp:effectExtent l="0" t="0" r="2540" b="3810"/>
+            <wp:docPr id="1039759809" name="Grafik 32" descr="Ein Bild, das Waschbecken, Metall, Küchenutensilien, Im Haus enthält.&#10;&#10;KI-generierte Inhalte können fehlerhaft sein."/>
+            <wp:cNvGraphicFramePr>
+              <a:graphicFrameLocks xmlns:a="http://schemas.openxmlformats.org/drawingml/2006/main" noChangeAspect="1"/>
+            </wp:cNvGraphicFramePr>
+            <a:graphic xmlns:a="http://schemas.openxmlformats.org/drawingml/2006/main">
+              <a:graphicData uri="http://schemas.openxmlformats.org/drawingml/2006/picture">
+                <pic:pic xmlns:pic="http://schemas.openxmlformats.org/drawingml/2006/picture">
+                  <pic:nvPicPr>
+                    <pic:cNvPr id="1039759809" name="Grafik 32" descr="Ein Bild, das Waschbecken, Metall, Küchenutensilien, Im Haus enthält.&#10;&#10;KI-generierte Inhalte können fehlerhaft sein."/>
+                    <pic:cNvPicPr>
+                      <a:picLocks noChangeAspect="1" noChangeArrowheads="1"/>
+                    </pic:cNvPicPr>
+                  </pic:nvPicPr>
+                  <pic:blipFill>
+                    <a:blip r:embed="rId44" cstate="print">
+                      <a:extLst>
+                        <a:ext uri="{28A0092B-C50C-407E-A947-70E740481C1C}">
+                          <a14:useLocalDpi xmlns:a14="http://schemas.microsoft.com/office/drawing/2010/main" val="0"/>
+                        </a:ext>
+                      </a:extLst>
+                    </a:blip>
+                    <a:srcRect/>
+                    <a:stretch>
+                      <a:fillRect/>
+                    </a:stretch>
+                  </pic:blipFill>
+                  <pic:spPr bwMode="auto">
+                    <a:xfrm>
+                      <a:off x="0" y="0"/>
+                      <a:ext cx="1205234" cy="1606076"/>
+                    </a:xfrm>
+                    <a:prstGeom prst="rect">
+                      <a:avLst/>
+                    </a:prstGeom>
+                    <a:noFill/>
+                    <a:ln>
+                      <a:noFill/>
+                    </a:ln>
+                  </pic:spPr>
+                </pic:pic>
+              </a:graphicData>
+            </a:graphic>
+          </wp:inline>
+        </w:drawing>
+      </w:r>
     </w:p>
     <w:p>
       <w:pPr>
         <w:pStyle w:val="Beschriftung"/>
       </w:pPr>
+      <w:bookmarkStart w:id="54" w:name="_Toc222227751"/>
+      <w:bookmarkStart w:id="55" w:name="_Toc222236776"/>
       <w:r>
         <w:t xml:space="preserve">Abbildung </w:t>
       </w:r>
@@ -14872,17 +15111,19 @@
       <w:r>
         <w:t xml:space="preserve"> LED-Box öffnen 7</w:t>
       </w:r>
+      <w:bookmarkEnd w:id="54"/>
+      <w:bookmarkEnd w:id="55"/>
     </w:p>
     <w:p>
       <w:pPr>
         <w:pStyle w:val="berschrift3"/>
       </w:pPr>
-      <w:bookmarkStart w:id="31" w:name="_Toc207105990"/>
+      <w:bookmarkStart w:id="56" w:name="_Toc222230595"/>
       <w:r>
         <w:lastRenderedPageBreak/>
         <w:t>Chip ersetzen</w:t>
       </w:r>
-      <w:bookmarkEnd w:id="31"/>
+      <w:bookmarkEnd w:id="56"/>
     </w:p>
     <w:p>
       <w:pPr>
@@ -14947,7 +15188,7 @@
                 <wp:cNvGraphicFramePr/>
                 <a:graphic xmlns:a="http://schemas.openxmlformats.org/drawingml/2006/main">
                   <a:graphicData uri="http://schemas.microsoft.com/office/word/2010/wordprocessingInk">
-                    <w14:contentPart bwMode="auto" r:id="rId43">
+                    <w14:contentPart bwMode="auto" r:id="rId45">
                       <w14:nvContentPartPr>
                         <w14:cNvContentPartPr/>
                       </w14:nvContentPartPr>
@@ -14983,7 +15224,7 @@
                 <o:lock v:ext="edit" aspectratio="t"/>
               </v:shapetype>
               <v:shape id="Freihand 11" o:spid="_x0000_s1026" type="#_x0000_t75" style="position:absolute;margin-left:9.95pt;margin-top:12.95pt;width:98.65pt;height:20.35pt;z-index:251741184;visibility:visible;mso-wrap-style:square;mso-wrap-distance-left:9pt;mso-wrap-distance-top:0;mso-wrap-distance-right:9pt;mso-wrap-distance-bottom:0;mso-position-horizontal:absolute;mso-position-horizontal-relative:text;mso-position-vertical:absolute;mso-position-vertical-relative:text" o:gfxdata="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">
-                <v:imagedata r:id="rId44" o:title=""/>
+                <v:imagedata r:id="rId46" o:title=""/>
               </v:shape>
             </w:pict>
           </mc:Fallback>
@@ -15011,7 +15252,7 @@
                 <wp:cNvGraphicFramePr/>
                 <a:graphic xmlns:a="http://schemas.openxmlformats.org/drawingml/2006/main">
                   <a:graphicData uri="http://schemas.microsoft.com/office/word/2010/wordprocessingInk">
-                    <w14:contentPart bwMode="auto" r:id="rId45">
+                    <w14:contentPart bwMode="auto" r:id="rId47">
                       <w14:nvContentPartPr>
                         <w14:cNvContentPartPr/>
                       </w14:nvContentPartPr>
@@ -15028,7 +15269,7 @@
           <mc:Fallback>
             <w:pict>
               <v:shape w14:anchorId="3800581E" id="Freihand 12" o:spid="_x0000_s1026" type="#_x0000_t75" style="position:absolute;margin-left:10.7pt;margin-top:68.5pt;width:103.6pt;height:32.3pt;z-index:251742208;visibility:visible;mso-wrap-style:square;mso-wrap-distance-left:9pt;mso-wrap-distance-top:0;mso-wrap-distance-right:9pt;mso-wrap-distance-bottom:0;mso-position-horizontal:absolute;mso-position-horizontal-relative:text;mso-position-vertical:absolute;mso-position-vertical-relative:text" o:gfxdata="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">
-                <v:imagedata r:id="rId46" o:title=""/>
+                <v:imagedata r:id="rId48" o:title=""/>
               </v:shape>
             </w:pict>
           </mc:Fallback>
@@ -15056,7 +15297,7 @@
                     </pic:cNvPicPr>
                   </pic:nvPicPr>
                   <pic:blipFill>
-                    <a:blip r:embed="rId47" cstate="print">
+                    <a:blip r:embed="rId49" cstate="print">
                       <a:extLst>
                         <a:ext uri="{28A0092B-C50C-407E-A947-70E740481C1C}">
                           <a14:useLocalDpi xmlns:a14="http://schemas.microsoft.com/office/drawing/2010/main" val="0"/>
@@ -15112,6 +15353,8 @@
       <w:pPr>
         <w:pStyle w:val="Beschriftung"/>
       </w:pPr>
+      <w:bookmarkStart w:id="57" w:name="_Toc222227752"/>
+      <w:bookmarkStart w:id="58" w:name="_Toc222236777"/>
       <w:r>
         <w:t xml:space="preserve">Abbildung </w:t>
       </w:r>
@@ -15126,6 +15369,8 @@
       <w:r>
         <w:t xml:space="preserve"> Chip ersetzen 1</w:t>
       </w:r>
+      <w:bookmarkEnd w:id="57"/>
+      <w:bookmarkEnd w:id="58"/>
     </w:p>
     <w:p>
       <w:pPr>
@@ -15240,6 +15485,8 @@
       <w:pPr>
         <w:pStyle w:val="Beschriftung"/>
       </w:pPr>
+      <w:bookmarkStart w:id="59" w:name="_Toc222227753"/>
+      <w:bookmarkStart w:id="60" w:name="_Toc222236778"/>
       <w:r>
         <w:t xml:space="preserve">Abbildung </w:t>
       </w:r>
@@ -15254,6 +15501,8 @@
       <w:r>
         <w:t xml:space="preserve"> Chip ersetzen 2</w:t>
       </w:r>
+      <w:bookmarkEnd w:id="59"/>
+      <w:bookmarkEnd w:id="60"/>
     </w:p>
     <w:p>
       <w:r>
@@ -15295,7 +15544,7 @@
                     </pic:cNvPicPr>
                   </pic:nvPicPr>
                   <pic:blipFill>
-                    <a:blip r:embed="rId48" cstate="print">
+                    <a:blip r:embed="rId50" cstate="print">
                       <a:extLst>
                         <a:ext uri="{28A0092B-C50C-407E-A947-70E740481C1C}">
                           <a14:useLocalDpi xmlns:a14="http://schemas.microsoft.com/office/drawing/2010/main" val="0"/>
@@ -15351,6 +15600,8 @@
       <w:pPr>
         <w:pStyle w:val="Beschriftung"/>
       </w:pPr>
+      <w:bookmarkStart w:id="61" w:name="_Toc222227754"/>
+      <w:bookmarkStart w:id="62" w:name="_Toc222236779"/>
       <w:r>
         <w:t xml:space="preserve">Abbildung </w:t>
       </w:r>
@@ -15365,6 +15616,8 @@
       <w:r>
         <w:t xml:space="preserve"> Chip ersetzen 3</w:t>
       </w:r>
+      <w:bookmarkEnd w:id="61"/>
+      <w:bookmarkEnd w:id="62"/>
     </w:p>
     <w:p>
       <w:r>
@@ -15381,7 +15634,7 @@
       <w:pPr>
         <w:pStyle w:val="berschrift3"/>
       </w:pPr>
-      <w:bookmarkStart w:id="32" w:name="_Toc207105991"/>
+      <w:bookmarkStart w:id="63" w:name="_Toc222230596"/>
       <w:r>
         <w:t xml:space="preserve">LED-Box mit Jumper </w:t>
       </w:r>
@@ -15394,7 +15647,7 @@
       <w:r>
         <w:t>ESP32 verbinden</w:t>
       </w:r>
-      <w:bookmarkEnd w:id="32"/>
+      <w:bookmarkEnd w:id="63"/>
     </w:p>
     <w:p>
       <w:r>
@@ -15406,6 +15659,9 @@
         <w:keepNext/>
       </w:pPr>
       <w:r>
+        <w:rPr>
+          <w:noProof/>
+        </w:rPr>
         <w:lastRenderedPageBreak/>
         <w:drawing>
           <wp:inline distT="0" distB="0" distL="0" distR="0" wp14:anchorId="539ECE9F" wp14:editId="46921A15">
@@ -15425,7 +15681,7 @@
                     </pic:cNvPicPr>
                   </pic:nvPicPr>
                   <pic:blipFill>
-                    <a:blip r:embed="rId49" cstate="print">
+                    <a:blip r:embed="rId51" cstate="print">
                       <a:extLst>
                         <a:ext uri="{28A0092B-C50C-407E-A947-70E740481C1C}">
                           <a14:useLocalDpi xmlns:a14="http://schemas.microsoft.com/office/drawing/2010/main" val="0"/>
@@ -15461,6 +15717,8 @@
       <w:pPr>
         <w:pStyle w:val="Beschriftung"/>
       </w:pPr>
+      <w:bookmarkStart w:id="64" w:name="_Toc222227755"/>
+      <w:bookmarkStart w:id="65" w:name="_Toc222236780"/>
       <w:r>
         <w:t xml:space="preserve">Abbildung </w:t>
       </w:r>
@@ -15475,17 +15733,19 @@
       <w:r>
         <w:t xml:space="preserve"> Gesteckte LED-Box</w:t>
       </w:r>
+      <w:bookmarkEnd w:id="64"/>
+      <w:bookmarkEnd w:id="65"/>
     </w:p>
     <w:p/>
     <w:p>
       <w:pPr>
         <w:pStyle w:val="berschrift3"/>
       </w:pPr>
-      <w:bookmarkStart w:id="33" w:name="_Toc207105992"/>
+      <w:bookmarkStart w:id="66" w:name="_Toc222230597"/>
       <w:r>
         <w:t>LED-Box zusammensetzen</w:t>
       </w:r>
-      <w:bookmarkEnd w:id="33"/>
+      <w:bookmarkEnd w:id="66"/>
     </w:p>
     <w:p>
       <w:r>
@@ -15497,6 +15757,9 @@
         <w:keepNext/>
       </w:pPr>
       <w:r>
+        <w:rPr>
+          <w:noProof/>
+        </w:rPr>
         <w:drawing>
           <wp:inline distT="0" distB="0" distL="0" distR="0" wp14:anchorId="49E2B3BD" wp14:editId="225FDCA8">
             <wp:extent cx="3514725" cy="2636044"/>
@@ -15515,7 +15778,7 @@
                     </pic:cNvPicPr>
                   </pic:nvPicPr>
                   <pic:blipFill>
-                    <a:blip r:embed="rId50">
+                    <a:blip r:embed="rId52">
                       <a:extLst>
                         <a:ext uri="{28A0092B-C50C-407E-A947-70E740481C1C}">
                           <a14:useLocalDpi xmlns:a14="http://schemas.microsoft.com/office/drawing/2010/main" val="0"/>
@@ -15551,6 +15814,8 @@
       <w:pPr>
         <w:pStyle w:val="Beschriftung"/>
       </w:pPr>
+      <w:bookmarkStart w:id="67" w:name="_Toc222227756"/>
+      <w:bookmarkStart w:id="68" w:name="_Toc222236781"/>
       <w:r>
         <w:t xml:space="preserve">Abbildung </w:t>
       </w:r>
@@ -15565,27 +15830,271 @@
       <w:r>
         <w:t xml:space="preserve"> EchoPlay Verbunden</w:t>
       </w:r>
+      <w:bookmarkEnd w:id="67"/>
+      <w:bookmarkEnd w:id="68"/>
+    </w:p>
+    <w:p>
+      <w:pPr>
+        <w:pStyle w:val="berschrift3"/>
+      </w:pPr>
+      <w:r>
+        <w:t>Programmiert Umgebung</w:t>
+      </w:r>
+    </w:p>
+    <w:p>
+      <w:bookmarkStart w:id="69" w:name="_Toc222230598"/>
+      <w:r>
+        <w:t>Zuerst wollten wir den Code in der ArduinoIDE erstellen, aber da diese nicht sehr übersichtlich und praktisch ist, haben wir uns für PlatformIO entschieden.</w:t>
+      </w:r>
+    </w:p>
+    <w:p>
+      <w:r>
+        <w:t>PlatformIO</w:t>
+      </w:r>
+      <w:r>
+        <w:t xml:space="preserve"> ist eine professionelle Entwicklungsumgebung, die speziell für Embedded-Systeme wie Arduino, ESP32 oder andere Mikrocontroller entwickelt wurde. Sie bietet eine bessere Projektstruktur, </w:t>
+      </w:r>
+      <w:r>
+        <w:lastRenderedPageBreak/>
+        <w:t>automatische Bibliotheksverwaltung, Unterstützung für verschiedene Boards und eine übersichtlichere Organisation des Codes.</w:t>
+      </w:r>
+    </w:p>
+    <w:p>
+      <w:r>
+        <w:t>Im Vergleich zur ArduinoIDE ermöglicht PlatformIO ein strukturierteres Arbeiten, was besonders bei grösseren Projekten von Vorteil ist.</w:t>
+      </w:r>
+    </w:p>
+    <w:p>
+      <w:pPr>
+        <w:pStyle w:val="berschrift3"/>
+      </w:pPr>
+      <w:r>
+        <w:t>Code Dokumentation</w:t>
+      </w:r>
+      <w:bookmarkEnd w:id="69"/>
+    </w:p>
+    <w:p>
+      <w:pPr>
+        <w:pStyle w:val="berschrift4"/>
+      </w:pPr>
+      <w:r>
+        <w:t>Main</w:t>
+      </w:r>
+    </w:p>
+    <w:p>
+      <w:r>
+        <w:t xml:space="preserve">Im Main hat es 2 Funktionen, </w:t>
+      </w:r>
+      <w:r>
+        <w:t xml:space="preserve">void setup() und void loop(). </w:t>
+      </w:r>
+      <w:r>
+        <w:t xml:space="preserve">Der void setup() </w:t>
+      </w:r>
+      <w:r>
+        <w:t>wird</w:t>
+      </w:r>
+      <w:r>
+        <w:t xml:space="preserve"> zuerst ausgeführt und dies nur </w:t>
+      </w:r>
+      <w:r>
+        <w:t>1-mal</w:t>
+      </w:r>
+      <w:r>
+        <w:t xml:space="preserve">. Denn Setup braucht </w:t>
+      </w:r>
+      <w:r>
+        <w:t>man,</w:t>
+      </w:r>
+      <w:r>
+        <w:t xml:space="preserve"> um das Programm vorzubereiten bevor </w:t>
+      </w:r>
+      <w:r>
+        <w:t>man,</w:t>
+      </w:r>
+      <w:r>
+        <w:t xml:space="preserve"> denn Hauptcode benutzt. Dann im void loop() ist dann der Hauptcode. Void loop() wird nach dem void setup() durchlaufen ausgeführt und hört nie auf, dort drin hat man </w:t>
+      </w:r>
+      <w:r>
+        <w:t>den Code,</w:t>
+      </w:r>
+      <w:r>
+        <w:t xml:space="preserve"> welchen man </w:t>
+      </w:r>
+      <w:r>
+        <w:t>immer laufen lassen will,</w:t>
+      </w:r>
+      <w:r>
+        <w:t xml:space="preserve"> und in meinem Projekt ist das </w:t>
+      </w:r>
+      <w:r>
+        <w:t>der Code,</w:t>
+      </w:r>
+      <w:r>
+        <w:t xml:space="preserve"> welcher </w:t>
+      </w:r>
+      <w:r>
+        <w:t>mein Programm</w:t>
+      </w:r>
+      <w:r>
+        <w:t xml:space="preserve"> steuert und ausführt.</w:t>
+      </w:r>
+    </w:p>
+    <w:p>
+      <w:r>
+        <w:t>Das Erste, was ich in meinem main mache, ist Libraries zu inkludieren und meine Variablen und Objekte zu erstellen. Nachdem kommt der void setup() in dem ich meine Pins und Knöpfe starte, mich mit dem Internet verbinde und das erste Programm auswähle. Im void loop() ist dann die Logik welches meine Programme auswählt. Wenn ich denn Gelben Knopf drücke, wird das nächste Programm gewählt. Beim Drücken des roten Knopfes wird der Bildschirm ausgeschaltet. Dann hat es noch einen Controller, welchen man benutzt, um die Programme zu steuern.</w:t>
+      </w:r>
+    </w:p>
+    <w:p>
+      <w:pPr>
+        <w:pStyle w:val="berschrift4"/>
+      </w:pPr>
+      <w:r>
+        <w:t>IProgramm und IGame</w:t>
+      </w:r>
+    </w:p>
+    <w:p>
+      <w:r>
+        <w:t xml:space="preserve">In meinem Projekt brauche ich zwei Interfaces. Interfaces </w:t>
+      </w:r>
+      <w:r>
+        <w:t>geben vor welche Funktionen abgeleitete Klassen haben müssen aber nicht wie, das ermöglicht das man mit einer Interface Variable Mehrer verschiedene Sachen machen kann. In meinem Code kann das Interface variabel die Funktion aller mein Programm ausführen, indem sie, sie auswählt. Das IProgramm Interface gibt vor wie ein Programm gemach sein soll, dass man es verwenden kann. IProgramm hat nur eine setup Funktion, um das Programm vorzubereiten und eine Update Funktion, welche das Programm ausführt, da ich aber noch Spiele machen haben wollte, habe ich noch das IGame Interface erstellt mit den zusätzlichen start und end Funktionen. Die start Funktion ist da, um den Anfangsbildschirm oder Menu anzuzeigen und die end Funktion ist da, um zu zeigen das, dass Spiel vorbei ist.</w:t>
+      </w:r>
+    </w:p>
+    <w:p>
+      <w:pPr>
+        <w:pStyle w:val="berschrift4"/>
+      </w:pPr>
+      <w:r>
+        <w:t>LedWallEndcode</w:t>
+      </w:r>
+      <w:r>
+        <w:t>r,</w:t>
+      </w:r>
+      <w:r>
+        <w:t xml:space="preserve"> WallDriver</w:t>
+      </w:r>
+      <w:r>
+        <w:t xml:space="preserve"> und Screen</w:t>
+      </w:r>
+    </w:p>
+    <w:p>
+      <w:r>
+        <w:t xml:space="preserve">Die LedWallEndcoder und WallDriver Libraries sind vom Projekt von David und Yves aber da sie etwas sehr </w:t>
+      </w:r>
+      <w:r>
+        <w:t>Ähnliches</w:t>
+      </w:r>
+      <w:r>
+        <w:t xml:space="preserve"> hatten konnte ich sie auch benutzen. </w:t>
+      </w:r>
+      <w:r>
+        <w:t>Im LedWallEndcoder hat es ein Zweidimensionales Array mit der Reihenfolge der Pixel von meinem Screen. Wenn man jetzt ein gewähltes Bild am Bildschirm anzeigen lassen will, muss man einen Buffer, also ein 256 lange Array mit einem Bild drin haben welches dann die Reihenfolge des Bildschirms richtig zugeordnet ist. Um dies zu machen, benutzen wir das Array mit der Reihenfolge des Bildschirms und ein zweidimensionales Array, welches das gewählte Bild hat. Wir haben dann eine Funktion LWC_Encode welches jeden Pixel welches der Bildschirm hat durchgeht. Für jeden Pixel nimmt es den Wert vom image und schreibt ihn in den Buffer mit der Position des Wertes vom Array mit der Reihenfolge vom Bildschirm und so kann es einen Buffer erstellen mit der richtigen Reihenfolge der Pixel. Jetzt mit dem Buffer können wir die WallDriver Library benutzen. Dort hat es eine Funktion, die den Buffer in den Bildschirm schiebt und dann die Pixel anzeigt.</w:t>
+      </w:r>
+      <w:r>
+        <w:t xml:space="preserve"> Da man vielleicht noch mehr als nur 1 Bildschirm verbinden will, habe ich noch eine Library erstellt mit der Klasse Screen. Die Klasse enthält die Funktionen von den Libraries LedWallEndcoder und WallDriver und noch zusätzliche Funktionen mit eigenem Buffer und image.</w:t>
+      </w:r>
+    </w:p>
+    <w:p>
+      <w:pPr>
+        <w:pStyle w:val="berschrift4"/>
+      </w:pPr>
+      <w:r>
+        <w:t>Snake</w:t>
+      </w:r>
+    </w:p>
+    <w:p>
+      <w:r>
+        <w:t xml:space="preserve">Snake war das erste Programm, welches ich erstellt habe. </w:t>
+      </w:r>
+      <w:r>
+        <w:t xml:space="preserve">Es ist vom IGame Interface abgeleitet also hat es Funktionen für setup, start, update und end. Im Setup setzte ich die Variablen zurück. Dann beim Start wird der Titelscreen mit Snake angezeigt. Nachdem man einer der beiden Knöpfe gedrückt hat, kommt ein Menü, indem man mit den Knöpfen die Schwierigkeit des Spieles wählen kann. Je höher die Schwierigkeit desto schnelle ist die Schlange dann im Spiel. Wenn man eine passende Schwierigkeit ausgewählt hat, kann man mit einem Doppelklick das Spiel starten. Die Schlange dreht sich in die Richtung des gedrückten Knopfes. Wenn man einen Apfel isst, welche auf dem Bildschirm platziert wird, dann wird man länger und noch ein Apfel wird platziert. Wenn man mit sich selbst oder dem Rand </w:t>
+      </w:r>
+      <w:r>
+        <w:lastRenderedPageBreak/>
+        <w:t>kollidiert, verliert man und es wird Game Over auf dem Screen gezeigt. Man kann dann mit dem Drücken eines beliebigen Knopes neustarten.</w:t>
+      </w:r>
+    </w:p>
+    <w:p>
+      <w:pPr>
+        <w:pStyle w:val="berschrift4"/>
+      </w:pPr>
+      <w:r>
+        <w:t>CarJump</w:t>
+      </w:r>
+    </w:p>
+    <w:p>
+      <w:r>
+        <w:t xml:space="preserve">CarJump ist stark vom Dino Spiel von Google inspiriert. Ich habe es Car Jump erstellt da es einfacher war dies auf dem Bildschirm zu zeigen. CarJump ist vom IGame Interface abgeleitet. Im Setup werden wieder </w:t>
+      </w:r>
+      <w:r>
+        <w:t>alle Variablen zurückgesetzt. Dann im Start wird dann eine Animation mit der Animation Klasse gezeigt. Die Animation Klasse habe ich erstellt, um verschiedene Animationen zu zeigen. Man muss ihr ein tFrame Array geben, jedes tFrame hat ein image und die Dauer, welche der Frame angeteigt werden soll, welches dann mit Render anzeigen kann. Wenn man dann einen beliebigen Knopf drückt, wird das Spiel gestartet. Das Spiel hat Autos, Wände und Flugzeuge, welchen man ausweiche, muss mit Hüpfen oder Ducken. Das Spiel wird mit der Zeit immer schwieriger und wenn man einer der Hindernisse berührt, verliert man und kommt zur End Funktion. Dort kann man dann auch mit einem drücken eines beliebigen Knopfes das Spiel nochmal starten.</w:t>
+      </w:r>
+    </w:p>
+    <w:p>
+      <w:pPr>
+        <w:pStyle w:val="berschrift4"/>
+      </w:pPr>
+      <w:r>
+        <w:t>Clock</w:t>
+      </w:r>
+    </w:p>
+    <w:p>
+      <w:r>
+        <w:t>Die Clock ist vom IProgramm Interface abgeleitet. Es hat nur ein setup und eine update Funktion. Im Setup werden alle Variablen wieder zurückgesetzt. Im Update holt sich der ESP dann mit dem NTPClient die das Datum und die Uhrzeit aus dem Internet. Weil wir das Datum und die Uhrzeit nicht separat holen, sondern nur beide gleichzeitig, trennen wir sie uns speichern sie in separaten Variablen. Dann kann man mit dem Drücken der Knöpfe zwischen das Anzeigen des Datums und der Uhrzeit wechseln.</w:t>
+      </w:r>
+    </w:p>
+    <w:p>
+      <w:pPr>
+        <w:pStyle w:val="berschrift4"/>
+      </w:pPr>
+      <w:r>
+        <w:t>Arkanoid</w:t>
+      </w:r>
+    </w:p>
+    <w:p>
+      <w:r>
+        <w:t xml:space="preserve">Arkanoid ist ein </w:t>
+      </w:r>
+      <w:r>
+        <w:t>Spiel,</w:t>
+      </w:r>
+      <w:r>
+        <w:t xml:space="preserve"> indem man </w:t>
+      </w:r>
+      <w:r>
+        <w:t>eine Plattform</w:t>
+      </w:r>
+      <w:r>
+        <w:t xml:space="preserve"> von links nach rechts steuert</w:t>
+      </w:r>
+      <w:r>
+        <w:t xml:space="preserve">. Mit dieser Plattform kann man einen Ball abprallen und dieser Ball kann Blöcke zerstören, welche auf der anderen Seite der Plattform ist. Das Ziel ist es alle Blöcke zu zerstören, ohne dass der Ball verloren geht. Diese Klasse ist von IGame abgeleitet. Im Setup werden alle Variablen zurückgesetzt und es werden auch alle Blöcke und Bälle, die man erstellen wollte, erstellt. Dann im start wird </w:t>
+      </w:r>
+      <w:r>
+        <w:t>wieder der Titelscreen angezeigt. Im Update wird dann für jeden aktuell aktiven Ball die Logik behandelt. Es wird die Logik für jeden Aktiven Block behandelt und es wird die Plattform bewegt, falls einer der Knöpfe gedrückt wird. Wenn man alle Blöcke zerstört hat, gewinnt man und wenn man den Ball verliert, verliert man.</w:t>
+      </w:r>
+    </w:p>
+    <w:p>
+      <w:pPr>
+        <w:pStyle w:val="berschrift2"/>
+      </w:pPr>
+      <w:bookmarkStart w:id="70" w:name="_Toc222230599"/>
+      <w:r>
+        <w:t>Kontrollieren</w:t>
+      </w:r>
+      <w:bookmarkEnd w:id="70"/>
     </w:p>
     <w:p/>
     <w:p>
       <w:pPr>
         <w:pStyle w:val="berschrift2"/>
       </w:pPr>
-      <w:bookmarkStart w:id="34" w:name="_Toc207105993"/>
-      <w:r>
-        <w:t>Kontrollieren</w:t>
-      </w:r>
-      <w:bookmarkEnd w:id="34"/>
-    </w:p>
-    <w:p>
-      <w:pPr>
-        <w:pStyle w:val="berschrift2"/>
-      </w:pPr>
-      <w:bookmarkStart w:id="35" w:name="_Toc207105994"/>
+      <w:bookmarkStart w:id="71" w:name="_Toc222230600"/>
       <w:r>
         <w:t>Auswerten</w:t>
       </w:r>
-      <w:bookmarkEnd w:id="35"/>
+      <w:bookmarkEnd w:id="71"/>
     </w:p>
     <w:p>
       <w:pPr>
@@ -15594,7 +16103,7 @@
           <w:color w:val="CCCC00" w:themeColor="text2"/>
         </w:rPr>
       </w:pPr>
-      <w:bookmarkStart w:id="36" w:name="_Toc207105995"/>
+      <w:bookmarkStart w:id="72" w:name="_Toc222230601"/>
       <w:r>
         <w:lastRenderedPageBreak/>
         <w:t>Verzeichnisse</w:t>
@@ -15605,19 +16114,20 @@
         </w:rPr>
         <w:t>.</w:t>
       </w:r>
-      <w:bookmarkEnd w:id="36"/>
+      <w:bookmarkEnd w:id="72"/>
     </w:p>
     <w:p>
       <w:pPr>
         <w:pStyle w:val="berschrift2"/>
       </w:pPr>
-      <w:bookmarkStart w:id="37" w:name="_Toc117236043"/>
-      <w:bookmarkStart w:id="38" w:name="_Toc207105996"/>
+      <w:bookmarkStart w:id="73" w:name="_Toc117236043"/>
+      <w:bookmarkStart w:id="74" w:name="_Toc222230602"/>
       <w:r>
         <w:t>Abbildungen</w:t>
       </w:r>
-      <w:bookmarkEnd w:id="37"/>
-      <w:bookmarkEnd w:id="38"/>
+      <w:bookmarkStart w:id="75" w:name="_Toc117236044"/>
+      <w:bookmarkEnd w:id="73"/>
+      <w:bookmarkEnd w:id="74"/>
     </w:p>
     <w:p>
       <w:pPr>
@@ -15636,24 +16146,15 @@
         </w:rPr>
       </w:pPr>
       <w:r>
-        <w:rPr>
-          <w:lang w:val="de-DE"/>
-        </w:rPr>
         <w:fldChar w:fldCharType="begin"/>
       </w:r>
       <w:r>
-        <w:rPr>
-          <w:lang w:val="de-DE"/>
-        </w:rPr>
         <w:instrText xml:space="preserve"> TOC \h \z \c "Abbildung" </w:instrText>
       </w:r>
       <w:r>
-        <w:rPr>
-          <w:lang w:val="de-DE"/>
-        </w:rPr>
         <w:fldChar w:fldCharType="separate"/>
       </w:r>
-      <w:hyperlink w:anchor="_Toc198107273" w:history="1">
+      <w:hyperlink w:anchor="_Toc222236756" w:history="1">
         <w:r>
           <w:rPr>
             <w:rStyle w:val="Hyperlink"/>
@@ -15680,7 +16181,7 @@
             <w:noProof/>
             <w:webHidden/>
           </w:rPr>
-          <w:instrText xml:space="preserve"> PAGEREF _Toc198107273 \h </w:instrText>
+          <w:instrText xml:space="preserve"> PAGEREF _Toc222236756 \h </w:instrText>
         </w:r>
         <w:r>
           <w:rPr>
@@ -15727,7 +16228,7 @@
           <w14:ligatures w14:val="standardContextual"/>
         </w:rPr>
       </w:pPr>
-      <w:hyperlink w:anchor="_Toc198107274" w:history="1">
+      <w:hyperlink w:anchor="_Toc222236757" w:history="1">
         <w:r>
           <w:rPr>
             <w:rStyle w:val="Hyperlink"/>
@@ -15754,7 +16255,7 @@
             <w:noProof/>
             <w:webHidden/>
           </w:rPr>
-          <w:instrText xml:space="preserve"> PAGEREF _Toc198107274 \h </w:instrText>
+          <w:instrText xml:space="preserve"> PAGEREF _Toc222236757 \h </w:instrText>
         </w:r>
         <w:r>
           <w:rPr>
@@ -15801,7 +16302,7 @@
           <w14:ligatures w14:val="standardContextual"/>
         </w:rPr>
       </w:pPr>
-      <w:hyperlink w:anchor="_Toc198107275" w:history="1">
+      <w:hyperlink w:anchor="_Toc222236758" w:history="1">
         <w:r>
           <w:rPr>
             <w:rStyle w:val="Hyperlink"/>
@@ -15828,7 +16329,7 @@
             <w:noProof/>
             <w:webHidden/>
           </w:rPr>
-          <w:instrText xml:space="preserve"> PAGEREF _Toc198107275 \h </w:instrText>
+          <w:instrText xml:space="preserve"> PAGEREF _Toc222236758 \h </w:instrText>
         </w:r>
         <w:r>
           <w:rPr>
@@ -15875,7 +16376,7 @@
           <w14:ligatures w14:val="standardContextual"/>
         </w:rPr>
       </w:pPr>
-      <w:hyperlink w:anchor="_Toc198107276" w:history="1">
+      <w:hyperlink w:anchor="_Toc222236759" w:history="1">
         <w:r>
           <w:rPr>
             <w:rStyle w:val="Hyperlink"/>
@@ -15902,7 +16403,7 @@
             <w:noProof/>
             <w:webHidden/>
           </w:rPr>
-          <w:instrText xml:space="preserve"> PAGEREF _Toc198107276 \h </w:instrText>
+          <w:instrText xml:space="preserve"> PAGEREF _Toc222236759 \h </w:instrText>
         </w:r>
         <w:r>
           <w:rPr>
@@ -15949,7 +16450,7 @@
           <w14:ligatures w14:val="standardContextual"/>
         </w:rPr>
       </w:pPr>
-      <w:hyperlink w:anchor="_Toc198107277" w:history="1">
+      <w:hyperlink w:anchor="_Toc222236760" w:history="1">
         <w:r>
           <w:rPr>
             <w:rStyle w:val="Hyperlink"/>
@@ -15976,7 +16477,7 @@
             <w:noProof/>
             <w:webHidden/>
           </w:rPr>
-          <w:instrText xml:space="preserve"> PAGEREF _Toc198107277 \h </w:instrText>
+          <w:instrText xml:space="preserve"> PAGEREF _Toc222236760 \h </w:instrText>
         </w:r>
         <w:r>
           <w:rPr>
@@ -16023,7 +16524,7 @@
           <w14:ligatures w14:val="standardContextual"/>
         </w:rPr>
       </w:pPr>
-      <w:hyperlink w:anchor="_Toc198107278" w:history="1">
+      <w:hyperlink w:anchor="_Toc222236761" w:history="1">
         <w:r>
           <w:rPr>
             <w:rStyle w:val="Hyperlink"/>
@@ -16050,7 +16551,7 @@
             <w:noProof/>
             <w:webHidden/>
           </w:rPr>
-          <w:instrText xml:space="preserve"> PAGEREF _Toc198107278 \h </w:instrText>
+          <w:instrText xml:space="preserve"> PAGEREF _Toc222236761 \h </w:instrText>
         </w:r>
         <w:r>
           <w:rPr>
@@ -16097,7 +16598,7 @@
           <w14:ligatures w14:val="standardContextual"/>
         </w:rPr>
       </w:pPr>
-      <w:hyperlink w:anchor="_Toc198107279" w:history="1">
+      <w:hyperlink w:anchor="_Toc222236762" w:history="1">
         <w:r>
           <w:rPr>
             <w:rStyle w:val="Hyperlink"/>
@@ -16124,7 +16625,7 @@
             <w:noProof/>
             <w:webHidden/>
           </w:rPr>
-          <w:instrText xml:space="preserve"> PAGEREF _Toc198107279 \h </w:instrText>
+          <w:instrText xml:space="preserve"> PAGEREF _Toc222236762 \h </w:instrText>
         </w:r>
         <w:r>
           <w:rPr>
@@ -16171,7 +16672,7 @@
           <w14:ligatures w14:val="standardContextual"/>
         </w:rPr>
       </w:pPr>
-      <w:hyperlink w:anchor="_Toc198107280" w:history="1">
+      <w:hyperlink w:anchor="_Toc222236763" w:history="1">
         <w:r>
           <w:rPr>
             <w:rStyle w:val="Hyperlink"/>
@@ -16198,7 +16699,7 @@
             <w:noProof/>
             <w:webHidden/>
           </w:rPr>
-          <w:instrText xml:space="preserve"> PAGEREF _Toc198107280 \h </w:instrText>
+          <w:instrText xml:space="preserve"> PAGEREF _Toc222236763 \h </w:instrText>
         </w:r>
         <w:r>
           <w:rPr>
@@ -16245,7 +16746,7 @@
           <w14:ligatures w14:val="standardContextual"/>
         </w:rPr>
       </w:pPr>
-      <w:hyperlink w:anchor="_Toc198107281" w:history="1">
+      <w:hyperlink w:anchor="_Toc222236764" w:history="1">
         <w:r>
           <w:rPr>
             <w:rStyle w:val="Hyperlink"/>
@@ -16272,7 +16773,7 @@
             <w:noProof/>
             <w:webHidden/>
           </w:rPr>
-          <w:instrText xml:space="preserve"> PAGEREF _Toc198107281 \h </w:instrText>
+          <w:instrText xml:space="preserve"> PAGEREF _Toc222236764 \h </w:instrText>
         </w:r>
         <w:r>
           <w:rPr>
@@ -16319,7 +16820,7 @@
           <w14:ligatures w14:val="standardContextual"/>
         </w:rPr>
       </w:pPr>
-      <w:hyperlink w:anchor="_Toc198107282" w:history="1">
+      <w:hyperlink w:anchor="_Toc222236765" w:history="1">
         <w:r>
           <w:rPr>
             <w:rStyle w:val="Hyperlink"/>
@@ -16346,7 +16847,7 @@
             <w:noProof/>
             <w:webHidden/>
           </w:rPr>
-          <w:instrText xml:space="preserve"> PAGEREF _Toc198107282 \h </w:instrText>
+          <w:instrText xml:space="preserve"> PAGEREF _Toc222236765 \h </w:instrText>
         </w:r>
         <w:r>
           <w:rPr>
@@ -16393,7 +16894,7 @@
           <w14:ligatures w14:val="standardContextual"/>
         </w:rPr>
       </w:pPr>
-      <w:hyperlink w:anchor="_Toc198107283" w:history="1">
+      <w:hyperlink w:anchor="_Toc222236766" w:history="1">
         <w:r>
           <w:rPr>
             <w:rStyle w:val="Hyperlink"/>
@@ -16420,7 +16921,7 @@
             <w:noProof/>
             <w:webHidden/>
           </w:rPr>
-          <w:instrText xml:space="preserve"> PAGEREF _Toc198107283 \h </w:instrText>
+          <w:instrText xml:space="preserve"> PAGEREF _Toc222236766 \h </w:instrText>
         </w:r>
         <w:r>
           <w:rPr>
@@ -16467,7 +16968,7 @@
           <w14:ligatures w14:val="standardContextual"/>
         </w:rPr>
       </w:pPr>
-      <w:hyperlink w:anchor="_Toc198107284" w:history="1">
+      <w:hyperlink w:anchor="_Toc222236767" w:history="1">
         <w:r>
           <w:rPr>
             <w:rStyle w:val="Hyperlink"/>
@@ -16494,7 +16995,7 @@
             <w:noProof/>
             <w:webHidden/>
           </w:rPr>
-          <w:instrText xml:space="preserve"> PAGEREF _Toc198107284 \h </w:instrText>
+          <w:instrText xml:space="preserve"> PAGEREF _Toc222236767 \h </w:instrText>
         </w:r>
         <w:r>
           <w:rPr>
@@ -16541,13 +17042,13 @@
           <w14:ligatures w14:val="standardContextual"/>
         </w:rPr>
       </w:pPr>
-      <w:hyperlink w:anchor="_Toc198107285" w:history="1">
+      <w:hyperlink w:anchor="_Toc222236768" w:history="1">
         <w:r>
           <w:rPr>
             <w:rStyle w:val="Hyperlink"/>
             <w:noProof/>
           </w:rPr>
-          <w:t>Abbildung 13 LED-Box öffnen 1</w:t>
+          <w:t>Abbildung 13 Modifizierter Steckplan</w:t>
         </w:r>
         <w:r>
           <w:rPr>
@@ -16568,7 +17069,7 @@
             <w:noProof/>
             <w:webHidden/>
           </w:rPr>
-          <w:instrText xml:space="preserve"> PAGEREF _Toc198107285 \h </w:instrText>
+          <w:instrText xml:space="preserve"> PAGEREF _Toc222236768 \h </w:instrText>
         </w:r>
         <w:r>
           <w:rPr>
@@ -16615,13 +17116,13 @@
           <w14:ligatures w14:val="standardContextual"/>
         </w:rPr>
       </w:pPr>
-      <w:hyperlink w:anchor="_Toc198107286" w:history="1">
+      <w:hyperlink w:anchor="_Toc222236769" w:history="1">
         <w:r>
           <w:rPr>
             <w:rStyle w:val="Hyperlink"/>
             <w:noProof/>
           </w:rPr>
-          <w:t>Abbildung 14 LED-Box öffnen 2</w:t>
+          <w:t>Abbildung 14 Steckplan</w:t>
         </w:r>
         <w:r>
           <w:rPr>
@@ -16642,7 +17143,7 @@
             <w:noProof/>
             <w:webHidden/>
           </w:rPr>
-          <w:instrText xml:space="preserve"> PAGEREF _Toc198107286 \h </w:instrText>
+          <w:instrText xml:space="preserve"> PAGEREF _Toc222236769 \h </w:instrText>
         </w:r>
         <w:r>
           <w:rPr>
@@ -16689,13 +17190,13 @@
           <w14:ligatures w14:val="standardContextual"/>
         </w:rPr>
       </w:pPr>
-      <w:hyperlink w:anchor="_Toc198107287" w:history="1">
+      <w:hyperlink w:anchor="_Toc222236770" w:history="1">
         <w:r>
           <w:rPr>
             <w:rStyle w:val="Hyperlink"/>
             <w:noProof/>
           </w:rPr>
-          <w:t>Abbildung 15 LED-Box öffnen 3</w:t>
+          <w:t>Abbildung 15 LED-Box öffnen 1</w:t>
         </w:r>
         <w:r>
           <w:rPr>
@@ -16716,7 +17217,7 @@
             <w:noProof/>
             <w:webHidden/>
           </w:rPr>
-          <w:instrText xml:space="preserve"> PAGEREF _Toc198107287 \h </w:instrText>
+          <w:instrText xml:space="preserve"> PAGEREF _Toc222236770 \h </w:instrText>
         </w:r>
         <w:r>
           <w:rPr>
@@ -16736,7 +17237,7 @@
             <w:noProof/>
             <w:webHidden/>
           </w:rPr>
-          <w:t>8</w:t>
+          <w:t>10</w:t>
         </w:r>
         <w:r>
           <w:rPr>
@@ -16763,13 +17264,13 @@
           <w14:ligatures w14:val="standardContextual"/>
         </w:rPr>
       </w:pPr>
-      <w:hyperlink w:anchor="_Toc198107288" w:history="1">
+      <w:hyperlink w:anchor="_Toc222236771" w:history="1">
         <w:r>
           <w:rPr>
             <w:rStyle w:val="Hyperlink"/>
             <w:noProof/>
           </w:rPr>
-          <w:t>Abbildung 16 LED-Box öffnen 4</w:t>
+          <w:t>Abbildung 16 LED-Box öffnen 2</w:t>
         </w:r>
         <w:r>
           <w:rPr>
@@ -16790,7 +17291,7 @@
             <w:noProof/>
             <w:webHidden/>
           </w:rPr>
-          <w:instrText xml:space="preserve"> PAGEREF _Toc198107288 \h </w:instrText>
+          <w:instrText xml:space="preserve"> PAGEREF _Toc222236771 \h </w:instrText>
         </w:r>
         <w:r>
           <w:rPr>
@@ -16810,7 +17311,7 @@
             <w:noProof/>
             <w:webHidden/>
           </w:rPr>
-          <w:t>9</w:t>
+          <w:t>10</w:t>
         </w:r>
         <w:r>
           <w:rPr>
@@ -16837,13 +17338,13 @@
           <w14:ligatures w14:val="standardContextual"/>
         </w:rPr>
       </w:pPr>
-      <w:hyperlink w:anchor="_Toc198107289" w:history="1">
+      <w:hyperlink w:anchor="_Toc222236772" w:history="1">
         <w:r>
           <w:rPr>
             <w:rStyle w:val="Hyperlink"/>
             <w:noProof/>
           </w:rPr>
-          <w:t>Abbildung 17 LED-Box öffnen 5</w:t>
+          <w:t>Abbildung 17 LED-Box öffnen 3</w:t>
         </w:r>
         <w:r>
           <w:rPr>
@@ -16864,7 +17365,7 @@
             <w:noProof/>
             <w:webHidden/>
           </w:rPr>
-          <w:instrText xml:space="preserve"> PAGEREF _Toc198107289 \h </w:instrText>
+          <w:instrText xml:space="preserve"> PAGEREF _Toc222236772 \h </w:instrText>
         </w:r>
         <w:r>
           <w:rPr>
@@ -16884,7 +17385,7 @@
             <w:noProof/>
             <w:webHidden/>
           </w:rPr>
-          <w:t>9</w:t>
+          <w:t>10</w:t>
         </w:r>
         <w:r>
           <w:rPr>
@@ -16911,13 +17412,13 @@
           <w14:ligatures w14:val="standardContextual"/>
         </w:rPr>
       </w:pPr>
-      <w:hyperlink w:anchor="_Toc198107290" w:history="1">
+      <w:hyperlink w:anchor="_Toc222236773" w:history="1">
         <w:r>
           <w:rPr>
             <w:rStyle w:val="Hyperlink"/>
             <w:noProof/>
           </w:rPr>
-          <w:t>Abbildung 18 LED-Box öffnen 6</w:t>
+          <w:t>Abbildung 18 LED-Box öffnen 4</w:t>
         </w:r>
         <w:r>
           <w:rPr>
@@ -16938,7 +17439,7 @@
             <w:noProof/>
             <w:webHidden/>
           </w:rPr>
-          <w:instrText xml:space="preserve"> PAGEREF _Toc198107290 \h </w:instrText>
+          <w:instrText xml:space="preserve"> PAGEREF _Toc222236773 \h </w:instrText>
         </w:r>
         <w:r>
           <w:rPr>
@@ -16958,7 +17459,7 @@
             <w:noProof/>
             <w:webHidden/>
           </w:rPr>
-          <w:t>9</w:t>
+          <w:t>10</w:t>
         </w:r>
         <w:r>
           <w:rPr>
@@ -16985,13 +17486,13 @@
           <w14:ligatures w14:val="standardContextual"/>
         </w:rPr>
       </w:pPr>
-      <w:hyperlink w:anchor="_Toc198107291" w:history="1">
+      <w:hyperlink w:anchor="_Toc222236774" w:history="1">
         <w:r>
           <w:rPr>
             <w:rStyle w:val="Hyperlink"/>
             <w:noProof/>
           </w:rPr>
-          <w:t>Abbildung 19 LED-Box öffnen 7</w:t>
+          <w:t>Abbildung 19 LED-Box öffnen 5</w:t>
         </w:r>
         <w:r>
           <w:rPr>
@@ -17012,7 +17513,7 @@
             <w:noProof/>
             <w:webHidden/>
           </w:rPr>
-          <w:instrText xml:space="preserve"> PAGEREF _Toc198107291 \h </w:instrText>
+          <w:instrText xml:space="preserve"> PAGEREF _Toc222236774 \h </w:instrText>
         </w:r>
         <w:r>
           <w:rPr>
@@ -17032,7 +17533,7 @@
             <w:noProof/>
             <w:webHidden/>
           </w:rPr>
-          <w:t>10</w:t>
+          <w:t>11</w:t>
         </w:r>
         <w:r>
           <w:rPr>
@@ -17042,23 +17543,6 @@
           <w:fldChar w:fldCharType="end"/>
         </w:r>
       </w:hyperlink>
-    </w:p>
-    <w:p>
-      <w:r>
-        <w:fldChar w:fldCharType="end"/>
-      </w:r>
-      <w:bookmarkStart w:id="39" w:name="_Toc117236044"/>
-    </w:p>
-    <w:p>
-      <w:pPr>
-        <w:pStyle w:val="berschrift2"/>
-      </w:pPr>
-      <w:bookmarkStart w:id="40" w:name="_Toc207105997"/>
-      <w:r>
-        <w:t>Tabellen</w:t>
-      </w:r>
-      <w:bookmarkEnd w:id="39"/>
-      <w:bookmarkEnd w:id="40"/>
     </w:p>
     <w:p>
       <w:pPr>
@@ -17076,6 +17560,540 @@
           <w14:ligatures w14:val="standardContextual"/>
         </w:rPr>
       </w:pPr>
+      <w:hyperlink w:anchor="_Toc222236775" w:history="1">
+        <w:r>
+          <w:rPr>
+            <w:rStyle w:val="Hyperlink"/>
+            <w:noProof/>
+          </w:rPr>
+          <w:t>Abbildung 20 LED-Box öffnen 6</w:t>
+        </w:r>
+        <w:r>
+          <w:rPr>
+            <w:noProof/>
+            <w:webHidden/>
+          </w:rPr>
+          <w:tab/>
+        </w:r>
+        <w:r>
+          <w:rPr>
+            <w:noProof/>
+            <w:webHidden/>
+          </w:rPr>
+          <w:fldChar w:fldCharType="begin"/>
+        </w:r>
+        <w:r>
+          <w:rPr>
+            <w:noProof/>
+            <w:webHidden/>
+          </w:rPr>
+          <w:instrText xml:space="preserve"> PAGEREF _Toc222236775 \h </w:instrText>
+        </w:r>
+        <w:r>
+          <w:rPr>
+            <w:noProof/>
+            <w:webHidden/>
+          </w:rPr>
+        </w:r>
+        <w:r>
+          <w:rPr>
+            <w:noProof/>
+            <w:webHidden/>
+          </w:rPr>
+          <w:fldChar w:fldCharType="separate"/>
+        </w:r>
+        <w:r>
+          <w:rPr>
+            <w:noProof/>
+            <w:webHidden/>
+          </w:rPr>
+          <w:t>11</w:t>
+        </w:r>
+        <w:r>
+          <w:rPr>
+            <w:noProof/>
+            <w:webHidden/>
+          </w:rPr>
+          <w:fldChar w:fldCharType="end"/>
+        </w:r>
+      </w:hyperlink>
+    </w:p>
+    <w:p>
+      <w:pPr>
+        <w:pStyle w:val="Abbildungsverzeichnis"/>
+        <w:tabs>
+          <w:tab w:val="right" w:leader="dot" w:pos="9346"/>
+        </w:tabs>
+        <w:rPr>
+          <w:rFonts w:asciiTheme="minorHAnsi" w:eastAsiaTheme="minorEastAsia" w:hAnsiTheme="minorHAnsi" w:cstheme="minorBidi"/>
+          <w:noProof/>
+          <w:kern w:val="2"/>
+          <w:sz w:val="24"/>
+          <w:szCs w:val="24"/>
+          <w:lang w:eastAsia="de-CH"/>
+          <w14:ligatures w14:val="standardContextual"/>
+        </w:rPr>
+      </w:pPr>
+      <w:hyperlink w:anchor="_Toc222236776" w:history="1">
+        <w:r>
+          <w:rPr>
+            <w:rStyle w:val="Hyperlink"/>
+            <w:noProof/>
+          </w:rPr>
+          <w:t>Abbildung 21 LED-Box öffnen 7</w:t>
+        </w:r>
+        <w:r>
+          <w:rPr>
+            <w:noProof/>
+            <w:webHidden/>
+          </w:rPr>
+          <w:tab/>
+        </w:r>
+        <w:r>
+          <w:rPr>
+            <w:noProof/>
+            <w:webHidden/>
+          </w:rPr>
+          <w:fldChar w:fldCharType="begin"/>
+        </w:r>
+        <w:r>
+          <w:rPr>
+            <w:noProof/>
+            <w:webHidden/>
+          </w:rPr>
+          <w:instrText xml:space="preserve"> PAGEREF _Toc222236776 \h </w:instrText>
+        </w:r>
+        <w:r>
+          <w:rPr>
+            <w:noProof/>
+            <w:webHidden/>
+          </w:rPr>
+        </w:r>
+        <w:r>
+          <w:rPr>
+            <w:noProof/>
+            <w:webHidden/>
+          </w:rPr>
+          <w:fldChar w:fldCharType="separate"/>
+        </w:r>
+        <w:r>
+          <w:rPr>
+            <w:noProof/>
+            <w:webHidden/>
+          </w:rPr>
+          <w:t>11</w:t>
+        </w:r>
+        <w:r>
+          <w:rPr>
+            <w:noProof/>
+            <w:webHidden/>
+          </w:rPr>
+          <w:fldChar w:fldCharType="end"/>
+        </w:r>
+      </w:hyperlink>
+    </w:p>
+    <w:p>
+      <w:pPr>
+        <w:pStyle w:val="Abbildungsverzeichnis"/>
+        <w:tabs>
+          <w:tab w:val="right" w:leader="dot" w:pos="9346"/>
+        </w:tabs>
+        <w:rPr>
+          <w:rFonts w:asciiTheme="minorHAnsi" w:eastAsiaTheme="minorEastAsia" w:hAnsiTheme="minorHAnsi" w:cstheme="minorBidi"/>
+          <w:noProof/>
+          <w:kern w:val="2"/>
+          <w:sz w:val="24"/>
+          <w:szCs w:val="24"/>
+          <w:lang w:eastAsia="de-CH"/>
+          <w14:ligatures w14:val="standardContextual"/>
+        </w:rPr>
+      </w:pPr>
+      <w:hyperlink w:anchor="_Toc222236777" w:history="1">
+        <w:r>
+          <w:rPr>
+            <w:rStyle w:val="Hyperlink"/>
+            <w:noProof/>
+          </w:rPr>
+          <w:t>Abbildung 22 Chip ersetzen 1</w:t>
+        </w:r>
+        <w:r>
+          <w:rPr>
+            <w:noProof/>
+            <w:webHidden/>
+          </w:rPr>
+          <w:tab/>
+        </w:r>
+        <w:r>
+          <w:rPr>
+            <w:noProof/>
+            <w:webHidden/>
+          </w:rPr>
+          <w:fldChar w:fldCharType="begin"/>
+        </w:r>
+        <w:r>
+          <w:rPr>
+            <w:noProof/>
+            <w:webHidden/>
+          </w:rPr>
+          <w:instrText xml:space="preserve"> PAGEREF _Toc222236777 \h </w:instrText>
+        </w:r>
+        <w:r>
+          <w:rPr>
+            <w:noProof/>
+            <w:webHidden/>
+          </w:rPr>
+        </w:r>
+        <w:r>
+          <w:rPr>
+            <w:noProof/>
+            <w:webHidden/>
+          </w:rPr>
+          <w:fldChar w:fldCharType="separate"/>
+        </w:r>
+        <w:r>
+          <w:rPr>
+            <w:noProof/>
+            <w:webHidden/>
+          </w:rPr>
+          <w:t>12</w:t>
+        </w:r>
+        <w:r>
+          <w:rPr>
+            <w:noProof/>
+            <w:webHidden/>
+          </w:rPr>
+          <w:fldChar w:fldCharType="end"/>
+        </w:r>
+      </w:hyperlink>
+    </w:p>
+    <w:p>
+      <w:pPr>
+        <w:pStyle w:val="Abbildungsverzeichnis"/>
+        <w:tabs>
+          <w:tab w:val="right" w:leader="dot" w:pos="9346"/>
+        </w:tabs>
+        <w:rPr>
+          <w:rFonts w:asciiTheme="minorHAnsi" w:eastAsiaTheme="minorEastAsia" w:hAnsiTheme="minorHAnsi" w:cstheme="minorBidi"/>
+          <w:noProof/>
+          <w:kern w:val="2"/>
+          <w:sz w:val="24"/>
+          <w:szCs w:val="24"/>
+          <w:lang w:eastAsia="de-CH"/>
+          <w14:ligatures w14:val="standardContextual"/>
+        </w:rPr>
+      </w:pPr>
+      <w:hyperlink w:anchor="_Toc222236778" w:history="1">
+        <w:r>
+          <w:rPr>
+            <w:rStyle w:val="Hyperlink"/>
+            <w:noProof/>
+          </w:rPr>
+          <w:t>Abbildung 23 Chip ersetzen 2</w:t>
+        </w:r>
+        <w:r>
+          <w:rPr>
+            <w:noProof/>
+            <w:webHidden/>
+          </w:rPr>
+          <w:tab/>
+        </w:r>
+        <w:r>
+          <w:rPr>
+            <w:noProof/>
+            <w:webHidden/>
+          </w:rPr>
+          <w:fldChar w:fldCharType="begin"/>
+        </w:r>
+        <w:r>
+          <w:rPr>
+            <w:noProof/>
+            <w:webHidden/>
+          </w:rPr>
+          <w:instrText xml:space="preserve"> PAGEREF _Toc222236778 \h </w:instrText>
+        </w:r>
+        <w:r>
+          <w:rPr>
+            <w:noProof/>
+            <w:webHidden/>
+          </w:rPr>
+        </w:r>
+        <w:r>
+          <w:rPr>
+            <w:noProof/>
+            <w:webHidden/>
+          </w:rPr>
+          <w:fldChar w:fldCharType="separate"/>
+        </w:r>
+        <w:r>
+          <w:rPr>
+            <w:noProof/>
+            <w:webHidden/>
+          </w:rPr>
+          <w:t>12</w:t>
+        </w:r>
+        <w:r>
+          <w:rPr>
+            <w:noProof/>
+            <w:webHidden/>
+          </w:rPr>
+          <w:fldChar w:fldCharType="end"/>
+        </w:r>
+      </w:hyperlink>
+    </w:p>
+    <w:p>
+      <w:pPr>
+        <w:pStyle w:val="Abbildungsverzeichnis"/>
+        <w:tabs>
+          <w:tab w:val="right" w:leader="dot" w:pos="9346"/>
+        </w:tabs>
+        <w:rPr>
+          <w:rFonts w:asciiTheme="minorHAnsi" w:eastAsiaTheme="minorEastAsia" w:hAnsiTheme="minorHAnsi" w:cstheme="minorBidi"/>
+          <w:noProof/>
+          <w:kern w:val="2"/>
+          <w:sz w:val="24"/>
+          <w:szCs w:val="24"/>
+          <w:lang w:eastAsia="de-CH"/>
+          <w14:ligatures w14:val="standardContextual"/>
+        </w:rPr>
+      </w:pPr>
+      <w:hyperlink w:anchor="_Toc222236779" w:history="1">
+        <w:r>
+          <w:rPr>
+            <w:rStyle w:val="Hyperlink"/>
+            <w:noProof/>
+          </w:rPr>
+          <w:t>Abbildung 24 Chip ersetzen 3</w:t>
+        </w:r>
+        <w:r>
+          <w:rPr>
+            <w:noProof/>
+            <w:webHidden/>
+          </w:rPr>
+          <w:tab/>
+        </w:r>
+        <w:r>
+          <w:rPr>
+            <w:noProof/>
+            <w:webHidden/>
+          </w:rPr>
+          <w:fldChar w:fldCharType="begin"/>
+        </w:r>
+        <w:r>
+          <w:rPr>
+            <w:noProof/>
+            <w:webHidden/>
+          </w:rPr>
+          <w:instrText xml:space="preserve"> PAGEREF _Toc222236779 \h </w:instrText>
+        </w:r>
+        <w:r>
+          <w:rPr>
+            <w:noProof/>
+            <w:webHidden/>
+          </w:rPr>
+        </w:r>
+        <w:r>
+          <w:rPr>
+            <w:noProof/>
+            <w:webHidden/>
+          </w:rPr>
+          <w:fldChar w:fldCharType="separate"/>
+        </w:r>
+        <w:r>
+          <w:rPr>
+            <w:noProof/>
+            <w:webHidden/>
+          </w:rPr>
+          <w:t>12</w:t>
+        </w:r>
+        <w:r>
+          <w:rPr>
+            <w:noProof/>
+            <w:webHidden/>
+          </w:rPr>
+          <w:fldChar w:fldCharType="end"/>
+        </w:r>
+      </w:hyperlink>
+    </w:p>
+    <w:p>
+      <w:pPr>
+        <w:pStyle w:val="Abbildungsverzeichnis"/>
+        <w:tabs>
+          <w:tab w:val="right" w:leader="dot" w:pos="9346"/>
+        </w:tabs>
+        <w:rPr>
+          <w:rFonts w:asciiTheme="minorHAnsi" w:eastAsiaTheme="minorEastAsia" w:hAnsiTheme="minorHAnsi" w:cstheme="minorBidi"/>
+          <w:noProof/>
+          <w:kern w:val="2"/>
+          <w:sz w:val="24"/>
+          <w:szCs w:val="24"/>
+          <w:lang w:eastAsia="de-CH"/>
+          <w14:ligatures w14:val="standardContextual"/>
+        </w:rPr>
+      </w:pPr>
+      <w:hyperlink w:anchor="_Toc222236780" w:history="1">
+        <w:r>
+          <w:rPr>
+            <w:rStyle w:val="Hyperlink"/>
+            <w:noProof/>
+          </w:rPr>
+          <w:t>Abbildung 25 Gesteckte LED-Box</w:t>
+        </w:r>
+        <w:r>
+          <w:rPr>
+            <w:noProof/>
+            <w:webHidden/>
+          </w:rPr>
+          <w:tab/>
+        </w:r>
+        <w:r>
+          <w:rPr>
+            <w:noProof/>
+            <w:webHidden/>
+          </w:rPr>
+          <w:fldChar w:fldCharType="begin"/>
+        </w:r>
+        <w:r>
+          <w:rPr>
+            <w:noProof/>
+            <w:webHidden/>
+          </w:rPr>
+          <w:instrText xml:space="preserve"> PAGEREF _Toc222236780 \h </w:instrText>
+        </w:r>
+        <w:r>
+          <w:rPr>
+            <w:noProof/>
+            <w:webHidden/>
+          </w:rPr>
+        </w:r>
+        <w:r>
+          <w:rPr>
+            <w:noProof/>
+            <w:webHidden/>
+          </w:rPr>
+          <w:fldChar w:fldCharType="separate"/>
+        </w:r>
+        <w:r>
+          <w:rPr>
+            <w:noProof/>
+            <w:webHidden/>
+          </w:rPr>
+          <w:t>13</w:t>
+        </w:r>
+        <w:r>
+          <w:rPr>
+            <w:noProof/>
+            <w:webHidden/>
+          </w:rPr>
+          <w:fldChar w:fldCharType="end"/>
+        </w:r>
+      </w:hyperlink>
+    </w:p>
+    <w:p>
+      <w:pPr>
+        <w:pStyle w:val="Abbildungsverzeichnis"/>
+        <w:tabs>
+          <w:tab w:val="right" w:leader="dot" w:pos="9346"/>
+        </w:tabs>
+        <w:rPr>
+          <w:rFonts w:asciiTheme="minorHAnsi" w:eastAsiaTheme="minorEastAsia" w:hAnsiTheme="minorHAnsi" w:cstheme="minorBidi"/>
+          <w:noProof/>
+          <w:kern w:val="2"/>
+          <w:sz w:val="24"/>
+          <w:szCs w:val="24"/>
+          <w:lang w:eastAsia="de-CH"/>
+          <w14:ligatures w14:val="standardContextual"/>
+        </w:rPr>
+      </w:pPr>
+      <w:hyperlink w:anchor="_Toc222236781" w:history="1">
+        <w:r>
+          <w:rPr>
+            <w:rStyle w:val="Hyperlink"/>
+            <w:noProof/>
+          </w:rPr>
+          <w:t>Abbildung 26 EchoPlay Verbunden</w:t>
+        </w:r>
+        <w:r>
+          <w:rPr>
+            <w:noProof/>
+            <w:webHidden/>
+          </w:rPr>
+          <w:tab/>
+        </w:r>
+        <w:r>
+          <w:rPr>
+            <w:noProof/>
+            <w:webHidden/>
+          </w:rPr>
+          <w:fldChar w:fldCharType="begin"/>
+        </w:r>
+        <w:r>
+          <w:rPr>
+            <w:noProof/>
+            <w:webHidden/>
+          </w:rPr>
+          <w:instrText xml:space="preserve"> PAGEREF _Toc222236781 \h </w:instrText>
+        </w:r>
+        <w:r>
+          <w:rPr>
+            <w:noProof/>
+            <w:webHidden/>
+          </w:rPr>
+        </w:r>
+        <w:r>
+          <w:rPr>
+            <w:noProof/>
+            <w:webHidden/>
+          </w:rPr>
+          <w:fldChar w:fldCharType="separate"/>
+        </w:r>
+        <w:r>
+          <w:rPr>
+            <w:noProof/>
+            <w:webHidden/>
+          </w:rPr>
+          <w:t>13</w:t>
+        </w:r>
+        <w:r>
+          <w:rPr>
+            <w:noProof/>
+            <w:webHidden/>
+          </w:rPr>
+          <w:fldChar w:fldCharType="end"/>
+        </w:r>
+      </w:hyperlink>
+    </w:p>
+    <w:p>
+      <w:r>
+        <w:fldChar w:fldCharType="end"/>
+      </w:r>
+    </w:p>
+    <w:p>
+      <w:pPr>
+        <w:pStyle w:val="berschrift2"/>
+      </w:pPr>
+      <w:bookmarkStart w:id="76" w:name="_Toc222230603"/>
+      <w:r>
+        <w:t>Tabellen</w:t>
+      </w:r>
+      <w:bookmarkEnd w:id="75"/>
+      <w:bookmarkEnd w:id="76"/>
+    </w:p>
+    <w:p>
+      <w:pPr>
+        <w:pStyle w:val="Abbildungsverzeichnis"/>
+        <w:tabs>
+          <w:tab w:val="right" w:leader="dot" w:pos="9346"/>
+        </w:tabs>
+        <w:rPr>
+          <w:rFonts w:asciiTheme="minorHAnsi" w:eastAsiaTheme="minorEastAsia" w:hAnsiTheme="minorHAnsi" w:cstheme="minorBidi"/>
+          <w:noProof/>
+          <w:kern w:val="2"/>
+          <w:sz w:val="24"/>
+          <w:szCs w:val="24"/>
+          <w:lang w:eastAsia="de-CH"/>
+          <w14:ligatures w14:val="standardContextual"/>
+        </w:rPr>
+      </w:pPr>
       <w:r>
         <w:rPr>
           <w:lang w:val="de-DE"/>
@@ -17166,18 +18184,18 @@
       </w:r>
     </w:p>
     <w:p>
-      <w:bookmarkStart w:id="41" w:name="_Toc117236045"/>
+      <w:bookmarkStart w:id="77" w:name="_Toc117236045"/>
     </w:p>
     <w:p>
       <w:pPr>
         <w:pStyle w:val="berschrift2"/>
       </w:pPr>
-      <w:bookmarkStart w:id="42" w:name="_Toc207105998"/>
+      <w:bookmarkStart w:id="78" w:name="_Toc222230604"/>
       <w:r>
         <w:t>Quellen</w:t>
       </w:r>
-      <w:bookmarkEnd w:id="41"/>
-      <w:bookmarkEnd w:id="42"/>
+      <w:bookmarkEnd w:id="77"/>
+      <w:bookmarkEnd w:id="78"/>
     </w:p>
     <w:p>
       <w:pPr>
@@ -17217,10 +18235,10 @@
       </w:r>
     </w:p>
     <w:sectPr>
-      <w:headerReference w:type="default" r:id="rId51"/>
-      <w:footerReference w:type="default" r:id="rId52"/>
-      <w:headerReference w:type="first" r:id="rId53"/>
-      <w:footerReference w:type="first" r:id="rId54"/>
+      <w:headerReference w:type="default" r:id="rId53"/>
+      <w:footerReference w:type="default" r:id="rId54"/>
+      <w:headerReference w:type="first" r:id="rId55"/>
+      <w:footerReference w:type="first" r:id="rId56"/>
       <w:pgSz w:w="11906" w:h="16838"/>
       <w:pgMar w:top="851" w:right="1274" w:bottom="993" w:left="1276" w:header="510" w:footer="567" w:gutter="0"/>
       <w:cols w:space="708"/>
@@ -18088,7 +19106,7 @@
       <w:lvlText w:val="%1.%2.%3.%4"/>
       <w:lvlJc w:val="left"/>
       <w:pPr>
-        <w:ind w:left="864" w:hanging="864"/>
+        <w:ind w:left="1147" w:hanging="864"/>
       </w:pPr>
     </w:lvl>
     <w:lvl w:ilvl="4">
@@ -20408,7 +21426,7 @@
     <w:lsdException w:name="Block Text" w:semiHidden="1" w:unhideWhenUsed="1"/>
     <w:lsdException w:name="Hyperlink" w:semiHidden="1" w:unhideWhenUsed="1"/>
     <w:lsdException w:name="FollowedHyperlink" w:semiHidden="1" w:unhideWhenUsed="1"/>
-    <w:lsdException w:name="Strong" w:uiPriority="22"/>
+    <w:lsdException w:name="Strong" w:uiPriority="22" w:qFormat="1"/>
     <w:lsdException w:name="Emphasis" w:uiPriority="20"/>
     <w:lsdException w:name="Document Map" w:semiHidden="1" w:unhideWhenUsed="1"/>
     <w:lsdException w:name="Plain Text" w:semiHidden="1" w:unhideWhenUsed="1"/>
@@ -20943,6 +21961,7 @@
   <w:style w:type="character" w:default="1" w:styleId="Absatz-Standardschriftart">
     <w:name w:val="Default Paragraph Font"/>
     <w:uiPriority w:val="1"/>
+    <w:semiHidden/>
     <w:unhideWhenUsed/>
   </w:style>
   <w:style w:type="table" w:default="1" w:styleId="NormaleTabelle">
@@ -21413,6 +22432,17 @@
       <w:u w:val="single"/>
     </w:rPr>
   </w:style>
+  <w:style w:type="character" w:styleId="Fett">
+    <w:name w:val="Strong"/>
+    <w:basedOn w:val="Absatz-Standardschriftart"/>
+    <w:uiPriority w:val="22"/>
+    <w:qFormat/>
+    <w:rsid w:val="0002087A"/>
+    <w:rPr>
+      <w:b/>
+      <w:bCs/>
+    </w:rPr>
+  </w:style>
 </w:styles>
 </file>
 
@@ -21531,7 +22561,7 @@
     <w:charset w:val="00"/>
     <w:family w:val="swiss"/>
     <w:pitch w:val="variable"/>
-    <w:sig w:usb0="E4002EFF" w:usb1="C200247B" w:usb2="00000009" w:usb3="00000000" w:csb0="000001FF" w:csb1="00000000"/>
+    <w:sig w:usb0="E5002EFF" w:usb1="C200ACFF" w:usb2="00000009" w:usb3="00000000" w:csb0="000001FF" w:csb1="00000000"/>
   </w:font>
   <w:font w:name="Arial">
     <w:panose1 w:val="020B0604020202020204"/>
@@ -21618,6 +22648,7 @@
     <w:rsid w:val="001F5387"/>
     <w:rsid w:val="002E2124"/>
     <w:rsid w:val="003208D2"/>
+    <w:rsid w:val="00334871"/>
     <w:rsid w:val="003B1CB4"/>
     <w:rsid w:val="00463896"/>
     <w:rsid w:val="00477ECE"/>
@@ -21637,6 +22668,9 @@
     <w:rsid w:val="00C7566B"/>
     <w:rsid w:val="00C8271A"/>
     <w:rsid w:val="00CA0A3A"/>
+    <w:rsid w:val="00D62864"/>
+    <w:rsid w:val="00E6714B"/>
+    <w:rsid w:val="00F443A8"/>
   </w:rsids>
   <m:mathPr>
     <m:mathFont m:val="Cambria Math"/>
@@ -22373,6 +23407,10 @@
 </file>
 
 <file path=customXml/item1.xml><?xml version="1.0" encoding="utf-8"?>
+<b:Sources xmlns:b="http://schemas.openxmlformats.org/officeDocument/2006/bibliography" xmlns="http://schemas.openxmlformats.org/officeDocument/2006/bibliography" SelectedStyle="\APASixthEditionOfficeOnline.xsl" StyleName="APA" Version="6"/>
+</file>
+
+<file path=customXml/item2.xml><?xml version="1.0" encoding="utf-8"?>
 <p:properties xmlns:p="http://schemas.microsoft.com/office/2006/metadata/properties" xmlns:xsi="http://www.w3.org/2001/XMLSchema-instance" xmlns:pc="http://schemas.microsoft.com/office/infopath/2007/PartnerControls">
   <documentManagement>
     <lcf76f155ced4ddcb4097134ff3c332f xmlns="46eb9099-7dd6-4793-9b95-bd76d8cd2ac6">
@@ -22381,15 +23419,6 @@
     <TaxCatchAll xmlns="b443b60d-c1ec-4166-a4bb-f67dccbf8c3d" xsi:nil="true"/>
   </documentManagement>
 </p:properties>
-</file>
-
-<file path=customXml/item2.xml><?xml version="1.0" encoding="utf-8"?>
-<?mso-contentType ?>
-<FormTemplates xmlns="http://schemas.microsoft.com/sharepoint/v3/contenttype/forms">
-  <Display>DocumentLibraryForm</Display>
-  <Edit>DocumentLibraryForm</Edit>
-  <New>DocumentLibraryForm</New>
-</FormTemplates>
 </file>
 
 <file path=customXml/item3.xml><?xml version="1.0" encoding="utf-8"?>
@@ -22600,24 +23629,29 @@
 </file>
 
 <file path=customXml/item4.xml><?xml version="1.0" encoding="utf-8"?>
-<b:Sources xmlns:b="http://schemas.openxmlformats.org/officeDocument/2006/bibliography" xmlns="http://schemas.openxmlformats.org/officeDocument/2006/bibliography" SelectedStyle="\APASixthEditionOfficeOnline.xsl" StyleName="APA" Version="6"/>
+<?mso-contentType ?>
+<FormTemplates xmlns="http://schemas.microsoft.com/sharepoint/v3/contenttype/forms">
+  <Display>DocumentLibraryForm</Display>
+  <Edit>DocumentLibraryForm</Edit>
+  <New>DocumentLibraryForm</New>
+</FormTemplates>
 </file>
 
 <file path=customXml/itemProps1.xml><?xml version="1.0" encoding="utf-8"?>
+<ds:datastoreItem xmlns:ds="http://schemas.openxmlformats.org/officeDocument/2006/customXml" ds:itemID="{B6F5B63D-75CB-41E9-9D4E-E58226A134E5}">
+  <ds:schemaRefs>
+    <ds:schemaRef ds:uri="http://schemas.openxmlformats.org/officeDocument/2006/bibliography"/>
+  </ds:schemaRefs>
+</ds:datastoreItem>
+</file>
+
+<file path=customXml/itemProps2.xml><?xml version="1.0" encoding="utf-8"?>
 <ds:datastoreItem xmlns:ds="http://schemas.openxmlformats.org/officeDocument/2006/customXml" ds:itemID="{CBA37030-E913-4E37-A03C-881271D4064D}">
   <ds:schemaRefs>
     <ds:schemaRef ds:uri="http://schemas.microsoft.com/office/2006/metadata/properties"/>
     <ds:schemaRef ds:uri="http://schemas.microsoft.com/office/infopath/2007/PartnerControls"/>
     <ds:schemaRef ds:uri="46eb9099-7dd6-4793-9b95-bd76d8cd2ac6"/>
     <ds:schemaRef ds:uri="b443b60d-c1ec-4166-a4bb-f67dccbf8c3d"/>
-  </ds:schemaRefs>
-</ds:datastoreItem>
-</file>
-
-<file path=customXml/itemProps2.xml><?xml version="1.0" encoding="utf-8"?>
-<ds:datastoreItem xmlns:ds="http://schemas.openxmlformats.org/officeDocument/2006/customXml" ds:itemID="{0494ADC6-6FDC-4384-9E53-3B9C03EA5998}">
-  <ds:schemaRefs>
-    <ds:schemaRef ds:uri="http://schemas.microsoft.com/sharepoint/v3/contenttype/forms"/>
   </ds:schemaRefs>
 </ds:datastoreItem>
 </file>
@@ -22642,9 +23676,9 @@
 </file>
 
 <file path=customXml/itemProps4.xml><?xml version="1.0" encoding="utf-8"?>
-<ds:datastoreItem xmlns:ds="http://schemas.openxmlformats.org/officeDocument/2006/customXml" ds:itemID="{B6F5B63D-75CB-41E9-9D4E-E58226A134E5}">
+<ds:datastoreItem xmlns:ds="http://schemas.openxmlformats.org/officeDocument/2006/customXml" ds:itemID="{0494ADC6-6FDC-4384-9E53-3B9C03EA5998}">
   <ds:schemaRefs>
-    <ds:schemaRef ds:uri="http://schemas.openxmlformats.org/officeDocument/2006/bibliography"/>
+    <ds:schemaRef ds:uri="http://schemas.microsoft.com/sharepoint/v3/contenttype/forms"/>
   </ds:schemaRefs>
 </ds:datastoreItem>
 </file>
</xml_diff>